<commit_message>
Implemented DB file, update journal
Rename Database/FullDatabase.sql to Database/FogLampAssemblyDB.sql (100% similarity — no content changes). Remove Database/advanceSQL-Project.slnx (solution deleted). Update Documentation/Advance SQL Project Journal.docx (binary changes to the journal document).
</commit_message>
<xml_diff>
--- a/Documentation/Advance SQL Project Journal.docx
+++ b/Documentation/Advance SQL Project Journal.docx
@@ -300,21 +300,25 @@
             <w:r>
               <w:t xml:space="preserve">Implemented ADO.NET using </w:t>
             </w:r>
+            <w:proofErr w:type="spellStart"/>
             <w:r>
               <w:rPr>
                 <w:highlight w:val="yellow"/>
               </w:rPr>
               <w:t>SqlDataAdapter</w:t>
             </w:r>
+            <w:proofErr w:type="spellEnd"/>
             <w:r>
               <w:t xml:space="preserve"> and </w:t>
             </w:r>
+            <w:proofErr w:type="spellStart"/>
             <w:r>
               <w:rPr>
                 <w:highlight w:val="yellow"/>
               </w:rPr>
               <w:t>SqlCommandBuilder</w:t>
             </w:r>
+            <w:proofErr w:type="spellEnd"/>
             <w:r>
               <w:t xml:space="preserve"> to bridge the WPF DataGrid with the SQL Server backend, allowing users to save edits directly to the database.</w:t>
             </w:r>
@@ -369,6 +373,506 @@
     </w:tbl>
     <w:p/>
     <w:p/>
+    <w:p>
+      <w:pPr>
+        <w:pStyle w:val="Heading1"/>
+        <w:rPr>
+          <w:b/>
+          <w:bCs/>
+        </w:rPr>
+      </w:pPr>
+      <w:r>
+        <w:rPr>
+          <w:b/>
+          <w:bCs/>
+        </w:rPr>
+        <w:lastRenderedPageBreak/>
+        <w:t>Milestone 2:</w:t>
+      </w:r>
+    </w:p>
+    <w:p>
+      <w:r>
+        <w:t>March 28, 2026</w:t>
+      </w:r>
+    </w:p>
+    <w:tbl>
+      <w:tblPr>
+        <w:tblStyle w:val="TableGrid"/>
+        <w:tblW w:w="0" w:type="auto"/>
+        <w:tblLook w:val="04A0" w:firstRow="1" w:lastRow="0" w:firstColumn="1" w:lastColumn="0" w:noHBand="0" w:noVBand="1"/>
+      </w:tblPr>
+      <w:tblGrid>
+        <w:gridCol w:w="2373"/>
+        <w:gridCol w:w="2015"/>
+        <w:gridCol w:w="2093"/>
+        <w:gridCol w:w="2869"/>
+      </w:tblGrid>
+      <w:tr>
+        <w:tc>
+          <w:tcPr>
+            <w:tcW w:w="2337" w:type="dxa"/>
+          </w:tcPr>
+          <w:p>
+            <w:r>
+              <w:t>Description</w:t>
+            </w:r>
+          </w:p>
+        </w:tc>
+        <w:tc>
+          <w:tcPr>
+            <w:tcW w:w="2337" w:type="dxa"/>
+          </w:tcPr>
+          <w:p>
+            <w:r>
+              <w:t xml:space="preserve">Team Member </w:t>
+            </w:r>
+          </w:p>
+        </w:tc>
+        <w:tc>
+          <w:tcPr>
+            <w:tcW w:w="2338" w:type="dxa"/>
+          </w:tcPr>
+          <w:p>
+            <w:r>
+              <w:t>Date &amp; Time Completed</w:t>
+            </w:r>
+          </w:p>
+        </w:tc>
+        <w:tc>
+          <w:tcPr>
+            <w:tcW w:w="2338" w:type="dxa"/>
+          </w:tcPr>
+          <w:p>
+            <w:r>
+              <w:t>Contribution</w:t>
+            </w:r>
+          </w:p>
+        </w:tc>
+      </w:tr>
+      <w:tr>
+        <w:tc>
+          <w:tcPr>
+            <w:tcW w:w="2337" w:type="dxa"/>
+          </w:tcPr>
+          <w:p>
+            <w:r>
+              <w:t>6. Advanced Database Programmability</w:t>
+            </w:r>
+          </w:p>
+        </w:tc>
+        <w:tc>
+          <w:tcPr>
+            <w:tcW w:w="2337" w:type="dxa"/>
+          </w:tcPr>
+          <w:p>
+            <w:r>
+              <w:t>Burhan and Tuan</w:t>
+            </w:r>
+          </w:p>
+        </w:tc>
+        <w:tc>
+          <w:tcPr>
+            <w:tcW w:w="2338" w:type="dxa"/>
+          </w:tcPr>
+          <w:p>
+            <w:r>
+              <w:t>Mar 26, 2026</w:t>
+            </w:r>
+          </w:p>
+        </w:tc>
+        <w:tc>
+          <w:tcPr>
+            <w:tcW w:w="2338" w:type="dxa"/>
+          </w:tcPr>
+          <w:p>
+            <w:r>
+              <w:t xml:space="preserve">Developed the complete </w:t>
+            </w:r>
+            <w:proofErr w:type="spellStart"/>
+            <w:r>
+              <w:rPr>
+                <w:highlight w:val="yellow"/>
+              </w:rPr>
+              <w:t>FogLampAssemblyDB.sql</w:t>
+            </w:r>
+            <w:proofErr w:type="spellEnd"/>
+            <w:r>
+              <w:t xml:space="preserve"> script. Implemented the core simulation logic at the database layer using stored procedures (</w:t>
+            </w:r>
+            <w:proofErr w:type="spellStart"/>
+            <w:r>
+              <w:rPr>
+                <w:highlight w:val="yellow"/>
+              </w:rPr>
+              <w:t>sp_BuildLamp</w:t>
+            </w:r>
+            <w:proofErr w:type="spellEnd"/>
+            <w:r>
+              <w:rPr>
+                <w:highlight w:val="yellow"/>
+              </w:rPr>
+              <w:t xml:space="preserve">, </w:t>
+            </w:r>
+            <w:proofErr w:type="spellStart"/>
+            <w:r>
+              <w:rPr>
+                <w:highlight w:val="yellow"/>
+              </w:rPr>
+              <w:t>sp_RefillAllBins</w:t>
+            </w:r>
+            <w:proofErr w:type="spellEnd"/>
+            <w:r>
+              <w:t xml:space="preserve">) and created the </w:t>
+            </w:r>
+            <w:proofErr w:type="spellStart"/>
+            <w:r>
+              <w:rPr>
+                <w:highlight w:val="yellow"/>
+              </w:rPr>
+              <w:t>trg_LowStockAlert</w:t>
+            </w:r>
+            <w:proofErr w:type="spellEnd"/>
+            <w:r>
+              <w:t xml:space="preserve"> trigger to automatically notify runners when bin quantities fall below the threshold.</w:t>
+            </w:r>
+          </w:p>
+        </w:tc>
+      </w:tr>
+      <w:tr>
+        <w:tc>
+          <w:tcPr>
+            <w:tcW w:w="2337" w:type="dxa"/>
+          </w:tcPr>
+          <w:p>
+            <w:pPr>
+              <w:jc w:val="both"/>
+            </w:pPr>
+            <w:r>
+              <w:t xml:space="preserve">7.Configuration </w:t>
+            </w:r>
+            <w:proofErr w:type="gramStart"/>
+            <w:r>
+              <w:t>Tool(</w:t>
+            </w:r>
+            <w:proofErr w:type="gramEnd"/>
+            <w:r>
+              <w:t>WPF&amp;ADO.NET)</w:t>
+            </w:r>
+          </w:p>
+        </w:tc>
+        <w:tc>
+          <w:tcPr>
+            <w:tcW w:w="2337" w:type="dxa"/>
+          </w:tcPr>
+          <w:p>
+            <w:r>
+              <w:t>Burhan and Tuan</w:t>
+            </w:r>
+          </w:p>
+        </w:tc>
+        <w:tc>
+          <w:tcPr>
+            <w:tcW w:w="2338" w:type="dxa"/>
+          </w:tcPr>
+          <w:p>
+            <w:r>
+              <w:t>Mar 26, 2026</w:t>
+            </w:r>
+          </w:p>
+        </w:tc>
+        <w:tc>
+          <w:tcPr>
+            <w:tcW w:w="2338" w:type="dxa"/>
+          </w:tcPr>
+          <w:p>
+            <w:r>
+              <w:t>Built the WPF Configuration Tool (</w:t>
+            </w:r>
+            <w:proofErr w:type="spellStart"/>
+            <w:r>
+              <w:rPr>
+                <w:highlight w:val="yellow"/>
+              </w:rPr>
+              <w:t>MainWindow.xaml</w:t>
+            </w:r>
+            <w:proofErr w:type="spellEnd"/>
+            <w:r>
+              <w:t xml:space="preserve">). Implemented the C# code-behind using </w:t>
+            </w:r>
+            <w:proofErr w:type="spellStart"/>
+            <w:r>
+              <w:rPr>
+                <w:highlight w:val="yellow"/>
+              </w:rPr>
+              <w:t>SqlDataAdapter</w:t>
+            </w:r>
+            <w:proofErr w:type="spellEnd"/>
+            <w:r>
+              <w:t xml:space="preserve"> and </w:t>
+            </w:r>
+            <w:proofErr w:type="spellStart"/>
+            <w:r>
+              <w:rPr>
+                <w:highlight w:val="yellow"/>
+              </w:rPr>
+              <w:t>SqlCommandBuilder</w:t>
+            </w:r>
+            <w:proofErr w:type="spellEnd"/>
+            <w:r>
+              <w:t xml:space="preserve"> to allow dynamic updates to simulation parameters. Added a "Reset Simulation" feature that safely calls </w:t>
+            </w:r>
+            <w:proofErr w:type="spellStart"/>
+            <w:r>
+              <w:rPr>
+                <w:highlight w:val="yellow"/>
+              </w:rPr>
+              <w:t>sp_ResetSimulation</w:t>
+            </w:r>
+            <w:proofErr w:type="spellEnd"/>
+            <w:r>
+              <w:t>.</w:t>
+            </w:r>
+          </w:p>
+        </w:tc>
+      </w:tr>
+      <w:tr>
+        <w:tc>
+          <w:tcPr>
+            <w:tcW w:w="2337" w:type="dxa"/>
+          </w:tcPr>
+          <w:p>
+            <w:r>
+              <w:t>8.</w:t>
+            </w:r>
+            <w:r>
+              <w:t xml:space="preserve"> </w:t>
+            </w:r>
+            <w:r>
+              <w:t>Simulation Engine Architecture (WPF)</w:t>
+            </w:r>
+          </w:p>
+        </w:tc>
+        <w:tc>
+          <w:tcPr>
+            <w:tcW w:w="2337" w:type="dxa"/>
+          </w:tcPr>
+          <w:p>
+            <w:r>
+              <w:t xml:space="preserve">Burhan and Tuan </w:t>
+            </w:r>
+          </w:p>
+        </w:tc>
+        <w:tc>
+          <w:tcPr>
+            <w:tcW w:w="2338" w:type="dxa"/>
+          </w:tcPr>
+          <w:p>
+            <w:r>
+              <w:t>Mar 26, 2026</w:t>
+            </w:r>
+          </w:p>
+        </w:tc>
+        <w:tc>
+          <w:tcPr>
+            <w:tcW w:w="2338" w:type="dxa"/>
+          </w:tcPr>
+          <w:p>
+            <w:r>
+              <w:t xml:space="preserve">Developed the Workstation Simulation as a WPF application. Implemented the </w:t>
+            </w:r>
+            <w:proofErr w:type="spellStart"/>
+            <w:r>
+              <w:rPr>
+                <w:highlight w:val="yellow"/>
+              </w:rPr>
+              <w:t>LoadStations</w:t>
+            </w:r>
+            <w:proofErr w:type="spellEnd"/>
+            <w:r>
+              <w:t xml:space="preserve"> method to populate the UI </w:t>
+            </w:r>
+            <w:proofErr w:type="spellStart"/>
+            <w:r>
+              <w:rPr>
+                <w:highlight w:val="yellow"/>
+              </w:rPr>
+              <w:t>ComboBox</w:t>
+            </w:r>
+            <w:proofErr w:type="spellEnd"/>
+            <w:r>
+              <w:t xml:space="preserve"> dynamically from the database, allowing multiple independent simulation </w:t>
+            </w:r>
+            <w:r>
+              <w:lastRenderedPageBreak/>
+              <w:t>instances to be launched simultaneously.</w:t>
+            </w:r>
+          </w:p>
+        </w:tc>
+      </w:tr>
+      <w:tr>
+        <w:tc>
+          <w:tcPr>
+            <w:tcW w:w="2337" w:type="dxa"/>
+          </w:tcPr>
+          <w:p>
+            <w:r>
+              <w:lastRenderedPageBreak/>
+              <w:t xml:space="preserve">9. </w:t>
+            </w:r>
+            <w:r>
+              <w:t>Multithreading &amp; Timing Logic</w:t>
+            </w:r>
+          </w:p>
+        </w:tc>
+        <w:tc>
+          <w:tcPr>
+            <w:tcW w:w="2337" w:type="dxa"/>
+          </w:tcPr>
+          <w:p>
+            <w:r>
+              <w:t>Tuan and Burhan</w:t>
+            </w:r>
+          </w:p>
+        </w:tc>
+        <w:tc>
+          <w:tcPr>
+            <w:tcW w:w="2338" w:type="dxa"/>
+          </w:tcPr>
+          <w:p>
+            <w:r>
+              <w:t>Mar 26, 2026</w:t>
+            </w:r>
+          </w:p>
+        </w:tc>
+        <w:tc>
+          <w:tcPr>
+            <w:tcW w:w="2338" w:type="dxa"/>
+          </w:tcPr>
+          <w:p>
+            <w:r>
+              <w:t>Engineered the background simulation thread (</w:t>
+            </w:r>
+            <w:proofErr w:type="spellStart"/>
+            <w:r>
+              <w:rPr>
+                <w:highlight w:val="yellow"/>
+              </w:rPr>
+              <w:t>SimulationLoop</w:t>
+            </w:r>
+            <w:proofErr w:type="spellEnd"/>
+            <w:r>
+              <w:t xml:space="preserve">). Integrated the </w:t>
+            </w:r>
+            <w:proofErr w:type="spellStart"/>
+            <w:r>
+              <w:rPr>
+                <w:highlight w:val="yellow"/>
+              </w:rPr>
+              <w:t>TimeScaleMultiplier</w:t>
+            </w:r>
+            <w:proofErr w:type="spellEnd"/>
+            <w:r>
+              <w:t xml:space="preserve"> from the configuration table to accurately scale </w:t>
+            </w:r>
+            <w:proofErr w:type="spellStart"/>
+            <w:r>
+              <w:rPr>
+                <w:highlight w:val="yellow"/>
+              </w:rPr>
+              <w:t>Thread.Sleep</w:t>
+            </w:r>
+            <w:proofErr w:type="spellEnd"/>
+            <w:r>
+              <w:rPr>
+                <w:highlight w:val="yellow"/>
+              </w:rPr>
+              <w:t>() delays</w:t>
+            </w:r>
+            <w:r>
+              <w:t>, ensuring the 60-second (+/- 10%) assembly time requirement is met without freezing the UI thread.</w:t>
+            </w:r>
+          </w:p>
+        </w:tc>
+      </w:tr>
+      <w:tr>
+        <w:tc>
+          <w:tcPr>
+            <w:tcW w:w="2337" w:type="dxa"/>
+          </w:tcPr>
+          <w:p>
+            <w:r>
+              <w:t xml:space="preserve">10. </w:t>
+            </w:r>
+            <w:r>
+              <w:t>Data Access &amp; UI Dispatching</w:t>
+            </w:r>
+          </w:p>
+        </w:tc>
+        <w:tc>
+          <w:tcPr>
+            <w:tcW w:w="2337" w:type="dxa"/>
+          </w:tcPr>
+          <w:p>
+            <w:r>
+              <w:t>Tuan and Burhan</w:t>
+            </w:r>
+          </w:p>
+        </w:tc>
+        <w:tc>
+          <w:tcPr>
+            <w:tcW w:w="2338" w:type="dxa"/>
+          </w:tcPr>
+          <w:p>
+            <w:r>
+              <w:t>Mar 26, 2026</w:t>
+            </w:r>
+          </w:p>
+        </w:tc>
+        <w:tc>
+          <w:tcPr>
+            <w:tcW w:w="2338" w:type="dxa"/>
+          </w:tcPr>
+          <w:p>
+            <w:r>
+              <w:t xml:space="preserve">Finalized the connection between the C# simulation and the SQL database. Used </w:t>
+            </w:r>
+            <w:proofErr w:type="spellStart"/>
+            <w:r>
+              <w:rPr>
+                <w:highlight w:val="yellow"/>
+              </w:rPr>
+              <w:t>SqlCommand</w:t>
+            </w:r>
+            <w:proofErr w:type="spellEnd"/>
+            <w:r>
+              <w:t xml:space="preserve"> to execute </w:t>
+            </w:r>
+            <w:proofErr w:type="spellStart"/>
+            <w:r>
+              <w:rPr>
+                <w:highlight w:val="yellow"/>
+              </w:rPr>
+              <w:t>sp_BuildLamp</w:t>
+            </w:r>
+            <w:proofErr w:type="spellEnd"/>
+            <w:r>
+              <w:t xml:space="preserve"> and capture output parameters (Pass/Fail status). Implemented </w:t>
+            </w:r>
+            <w:proofErr w:type="spellStart"/>
+            <w:r>
+              <w:rPr>
+                <w:highlight w:val="yellow"/>
+              </w:rPr>
+              <w:t>Dispatcher.Invoke</w:t>
+            </w:r>
+            <w:proofErr w:type="spellEnd"/>
+            <w:r>
+              <w:t xml:space="preserve"> to safely update the WPF UI with real-time build statistics.</w:t>
+            </w:r>
+          </w:p>
+        </w:tc>
+      </w:tr>
+    </w:tbl>
     <w:p/>
     <w:sectPr>
       <w:pgSz w:w="12240" w:h="15840"/>

</xml_diff>

<commit_message>
Update Advance SQL Project Journal.docx
Update the Documentation/Advance SQL Project Journal.docx binary file. This commit replaces the project journal document with a revised version containing updates to the Advance SQL project journal entries and notes.
</commit_message>
<xml_diff>
--- a/Documentation/Advance SQL Project Journal.docx
+++ b/Documentation/Advance SQL Project Journal.docx
@@ -138,15 +138,7 @@
           </w:tcPr>
           <w:p>
             <w:r>
-              <w:t xml:space="preserve">Designed the scalable relational database schema (7 tables including Configuration, Workstation, and </w:t>
-            </w:r>
-            <w:proofErr w:type="spellStart"/>
-            <w:r>
-              <w:t>PartInventory</w:t>
-            </w:r>
-            <w:proofErr w:type="spellEnd"/>
-            <w:r>
-              <w:t>) to ensure the foundation can support the C# simulation and Kanban visualizations required for Milestone 2.</w:t>
+              <w:t>Designed the scalable relational database schema (7 tables including Configuration, Workstation, and PartInventory) to ensure the foundation can support the C# simulation and Kanban visualizations required for Milestone 2.</w:t>
             </w:r>
           </w:p>
         </w:tc>
@@ -193,14 +185,12 @@
             <w:r>
               <w:t xml:space="preserve">Wrote the T-SQL script to create the </w:t>
             </w:r>
-            <w:proofErr w:type="spellStart"/>
             <w:r>
               <w:rPr>
                 <w:highlight w:val="yellow"/>
               </w:rPr>
               <w:t>FogLampAssemblyDB</w:t>
             </w:r>
-            <w:proofErr w:type="spellEnd"/>
             <w:r>
               <w:t xml:space="preserve"> and the </w:t>
             </w:r>
@@ -300,25 +290,21 @@
             <w:r>
               <w:t xml:space="preserve">Implemented ADO.NET using </w:t>
             </w:r>
-            <w:proofErr w:type="spellStart"/>
             <w:r>
               <w:rPr>
                 <w:highlight w:val="yellow"/>
               </w:rPr>
               <w:t>SqlDataAdapter</w:t>
             </w:r>
-            <w:proofErr w:type="spellEnd"/>
             <w:r>
               <w:t xml:space="preserve"> and </w:t>
             </w:r>
-            <w:proofErr w:type="spellStart"/>
             <w:r>
               <w:rPr>
                 <w:highlight w:val="yellow"/>
               </w:rPr>
               <w:t>SqlCommandBuilder</w:t>
             </w:r>
-            <w:proofErr w:type="spellEnd"/>
             <w:r>
               <w:t xml:space="preserve"> to bridge the WPF DataGrid with the SQL Server backend, allowing users to save edits directly to the database.</w:t>
             </w:r>
@@ -410,7 +396,7 @@
       <w:tr>
         <w:tc>
           <w:tcPr>
-            <w:tcW w:w="2337" w:type="dxa"/>
+            <w:tcW w:w="2373" w:type="dxa"/>
           </w:tcPr>
           <w:p>
             <w:r>
@@ -420,7 +406,7 @@
         </w:tc>
         <w:tc>
           <w:tcPr>
-            <w:tcW w:w="2337" w:type="dxa"/>
+            <w:tcW w:w="2015" w:type="dxa"/>
           </w:tcPr>
           <w:p>
             <w:r>
@@ -430,7 +416,7 @@
         </w:tc>
         <w:tc>
           <w:tcPr>
-            <w:tcW w:w="2338" w:type="dxa"/>
+            <w:tcW w:w="2093" w:type="dxa"/>
           </w:tcPr>
           <w:p>
             <w:r>
@@ -440,7 +426,7 @@
         </w:tc>
         <w:tc>
           <w:tcPr>
-            <w:tcW w:w="2338" w:type="dxa"/>
+            <w:tcW w:w="2869" w:type="dxa"/>
           </w:tcPr>
           <w:p>
             <w:r>
@@ -452,7 +438,7 @@
       <w:tr>
         <w:tc>
           <w:tcPr>
-            <w:tcW w:w="2337" w:type="dxa"/>
+            <w:tcW w:w="2373" w:type="dxa"/>
           </w:tcPr>
           <w:p>
             <w:r>
@@ -462,7 +448,7 @@
         </w:tc>
         <w:tc>
           <w:tcPr>
-            <w:tcW w:w="2337" w:type="dxa"/>
+            <w:tcW w:w="2015" w:type="dxa"/>
           </w:tcPr>
           <w:p>
             <w:r>
@@ -472,7 +458,7 @@
         </w:tc>
         <w:tc>
           <w:tcPr>
-            <w:tcW w:w="2338" w:type="dxa"/>
+            <w:tcW w:w="2093" w:type="dxa"/>
           </w:tcPr>
           <w:p>
             <w:r>
@@ -482,392 +468,1382 @@
         </w:tc>
         <w:tc>
           <w:tcPr>
-            <w:tcW w:w="2338" w:type="dxa"/>
+            <w:tcW w:w="2869" w:type="dxa"/>
           </w:tcPr>
           <w:p>
             <w:r>
               <w:t xml:space="preserve">Developed the complete </w:t>
             </w:r>
-            <w:proofErr w:type="spellStart"/>
             <w:r>
               <w:rPr>
                 <w:highlight w:val="yellow"/>
               </w:rPr>
               <w:t>FogLampAssemblyDB.sql</w:t>
             </w:r>
-            <w:proofErr w:type="spellEnd"/>
             <w:r>
               <w:t xml:space="preserve"> script. Implemented the core simulation logic at the database layer using stored procedures (</w:t>
             </w:r>
-            <w:proofErr w:type="spellStart"/>
+            <w:r>
+              <w:rPr>
+                <w:highlight w:val="yellow"/>
+              </w:rPr>
+              <w:t>sp_BuildLamp, sp_RefillAllBins</w:t>
+            </w:r>
+            <w:r>
+              <w:t xml:space="preserve">) and created the </w:t>
+            </w:r>
+            <w:r>
+              <w:rPr>
+                <w:highlight w:val="yellow"/>
+              </w:rPr>
+              <w:t>trg_LowStockAlert</w:t>
+            </w:r>
+            <w:r>
+              <w:t xml:space="preserve"> trigger to automatically notify runners when bin quantities fall below the threshold.</w:t>
+            </w:r>
+          </w:p>
+        </w:tc>
+      </w:tr>
+      <w:tr>
+        <w:tc>
+          <w:tcPr>
+            <w:tcW w:w="2373" w:type="dxa"/>
+          </w:tcPr>
+          <w:p>
+            <w:pPr>
+              <w:jc w:val="both"/>
+            </w:pPr>
+            <w:r>
+              <w:t>7.Configuration Tool(WPF&amp;ADO.NET)</w:t>
+            </w:r>
+          </w:p>
+        </w:tc>
+        <w:tc>
+          <w:tcPr>
+            <w:tcW w:w="2015" w:type="dxa"/>
+          </w:tcPr>
+          <w:p>
+            <w:r>
+              <w:t>Burhan and Tuan</w:t>
+            </w:r>
+          </w:p>
+        </w:tc>
+        <w:tc>
+          <w:tcPr>
+            <w:tcW w:w="2093" w:type="dxa"/>
+          </w:tcPr>
+          <w:p>
+            <w:r>
+              <w:t>Mar 26, 2026</w:t>
+            </w:r>
+          </w:p>
+        </w:tc>
+        <w:tc>
+          <w:tcPr>
+            <w:tcW w:w="2869" w:type="dxa"/>
+          </w:tcPr>
+          <w:p>
+            <w:r>
+              <w:t>Built the WPF Configuration Tool (</w:t>
+            </w:r>
+            <w:r>
+              <w:rPr>
+                <w:highlight w:val="yellow"/>
+              </w:rPr>
+              <w:t>MainWindow.xaml</w:t>
+            </w:r>
+            <w:r>
+              <w:t xml:space="preserve">). Implemented the C# code-behind using </w:t>
+            </w:r>
+            <w:r>
+              <w:rPr>
+                <w:highlight w:val="yellow"/>
+              </w:rPr>
+              <w:t>SqlDataAdapter</w:t>
+            </w:r>
+            <w:r>
+              <w:t xml:space="preserve"> and </w:t>
+            </w:r>
+            <w:r>
+              <w:rPr>
+                <w:highlight w:val="yellow"/>
+              </w:rPr>
+              <w:t>SqlCommandBuilder</w:t>
+            </w:r>
+            <w:r>
+              <w:t xml:space="preserve"> to allow dynamic updates to simulation parameters. Added a "Reset Simulation" feature that safely calls </w:t>
+            </w:r>
+            <w:r>
+              <w:rPr>
+                <w:highlight w:val="yellow"/>
+              </w:rPr>
+              <w:t>sp_ResetSimulation</w:t>
+            </w:r>
+            <w:r>
+              <w:t>.</w:t>
+            </w:r>
+          </w:p>
+        </w:tc>
+      </w:tr>
+      <w:tr>
+        <w:tc>
+          <w:tcPr>
+            <w:tcW w:w="2373" w:type="dxa"/>
+          </w:tcPr>
+          <w:p>
+            <w:r>
+              <w:t>8.</w:t>
+            </w:r>
+            <w:r>
+              <w:t xml:space="preserve"> Simulation Engine Architecture (WPF)</w:t>
+            </w:r>
+          </w:p>
+        </w:tc>
+        <w:tc>
+          <w:tcPr>
+            <w:tcW w:w="2015" w:type="dxa"/>
+          </w:tcPr>
+          <w:p>
+            <w:r>
+              <w:t xml:space="preserve">Burhan and Tuan </w:t>
+            </w:r>
+          </w:p>
+        </w:tc>
+        <w:tc>
+          <w:tcPr>
+            <w:tcW w:w="2093" w:type="dxa"/>
+          </w:tcPr>
+          <w:p>
+            <w:r>
+              <w:t>Mar 26, 2026</w:t>
+            </w:r>
+          </w:p>
+        </w:tc>
+        <w:tc>
+          <w:tcPr>
+            <w:tcW w:w="2869" w:type="dxa"/>
+          </w:tcPr>
+          <w:p>
+            <w:r>
+              <w:t xml:space="preserve">Developed the Workstation Simulation as a WPF application. Implemented the </w:t>
+            </w:r>
+            <w:r>
+              <w:rPr>
+                <w:highlight w:val="yellow"/>
+              </w:rPr>
+              <w:t>LoadStations</w:t>
+            </w:r>
+            <w:r>
+              <w:t xml:space="preserve"> method to populate the UI </w:t>
+            </w:r>
+            <w:r>
+              <w:rPr>
+                <w:highlight w:val="yellow"/>
+              </w:rPr>
+              <w:t>ComboBox</w:t>
+            </w:r>
+            <w:r>
+              <w:t xml:space="preserve"> dynamically from the database, allowing multiple independent simulation </w:t>
+            </w:r>
+            <w:r>
+              <w:lastRenderedPageBreak/>
+              <w:t>instances to be launched simultaneously.</w:t>
+            </w:r>
+          </w:p>
+        </w:tc>
+      </w:tr>
+      <w:tr>
+        <w:tc>
+          <w:tcPr>
+            <w:tcW w:w="2373" w:type="dxa"/>
+          </w:tcPr>
+          <w:p>
+            <w:r>
+              <w:lastRenderedPageBreak/>
+              <w:t xml:space="preserve">9. </w:t>
+            </w:r>
+            <w:r>
+              <w:t>Multithreading &amp; Timing Logic</w:t>
+            </w:r>
+          </w:p>
+        </w:tc>
+        <w:tc>
+          <w:tcPr>
+            <w:tcW w:w="2015" w:type="dxa"/>
+          </w:tcPr>
+          <w:p>
+            <w:r>
+              <w:t>Tuan and Burhan</w:t>
+            </w:r>
+          </w:p>
+        </w:tc>
+        <w:tc>
+          <w:tcPr>
+            <w:tcW w:w="2093" w:type="dxa"/>
+          </w:tcPr>
+          <w:p>
+            <w:r>
+              <w:t>Mar 26, 2026</w:t>
+            </w:r>
+          </w:p>
+        </w:tc>
+        <w:tc>
+          <w:tcPr>
+            <w:tcW w:w="2869" w:type="dxa"/>
+          </w:tcPr>
+          <w:p>
+            <w:r>
+              <w:t>Engineered the background simulation thread (</w:t>
+            </w:r>
+            <w:r>
+              <w:rPr>
+                <w:highlight w:val="yellow"/>
+              </w:rPr>
+              <w:t>SimulationLoop</w:t>
+            </w:r>
+            <w:r>
+              <w:t xml:space="preserve">). Integrated the </w:t>
+            </w:r>
+            <w:r>
+              <w:rPr>
+                <w:highlight w:val="yellow"/>
+              </w:rPr>
+              <w:t>TimeScaleMultiplier</w:t>
+            </w:r>
+            <w:r>
+              <w:t xml:space="preserve"> from the configuration table to accurately scale </w:t>
+            </w:r>
+            <w:r>
+              <w:rPr>
+                <w:highlight w:val="yellow"/>
+              </w:rPr>
+              <w:t>Thread.Sleep() delays</w:t>
+            </w:r>
+            <w:r>
+              <w:t>, ensuring the 60-second (+/- 10%) assembly time requirement is met without freezing the UI thread.</w:t>
+            </w:r>
+          </w:p>
+        </w:tc>
+      </w:tr>
+      <w:tr>
+        <w:tc>
+          <w:tcPr>
+            <w:tcW w:w="2373" w:type="dxa"/>
+          </w:tcPr>
+          <w:p>
+            <w:r>
+              <w:t xml:space="preserve">10. </w:t>
+            </w:r>
+            <w:r>
+              <w:t>Data Access &amp; UI Dispatching</w:t>
+            </w:r>
+          </w:p>
+        </w:tc>
+        <w:tc>
+          <w:tcPr>
+            <w:tcW w:w="2015" w:type="dxa"/>
+          </w:tcPr>
+          <w:p>
+            <w:r>
+              <w:t>Tuan and Burhan</w:t>
+            </w:r>
+          </w:p>
+        </w:tc>
+        <w:tc>
+          <w:tcPr>
+            <w:tcW w:w="2093" w:type="dxa"/>
+          </w:tcPr>
+          <w:p>
+            <w:r>
+              <w:t>Mar 26, 2026</w:t>
+            </w:r>
+          </w:p>
+        </w:tc>
+        <w:tc>
+          <w:tcPr>
+            <w:tcW w:w="2869" w:type="dxa"/>
+          </w:tcPr>
+          <w:p>
+            <w:r>
+              <w:t xml:space="preserve">Finalized the connection between the C# simulation and the SQL database. Used </w:t>
+            </w:r>
+            <w:r>
+              <w:rPr>
+                <w:highlight w:val="yellow"/>
+              </w:rPr>
+              <w:t>SqlCommand</w:t>
+            </w:r>
+            <w:r>
+              <w:t xml:space="preserve"> to execute </w:t>
+            </w:r>
             <w:r>
               <w:rPr>
                 <w:highlight w:val="yellow"/>
               </w:rPr>
               <w:t>sp_BuildLamp</w:t>
             </w:r>
-            <w:proofErr w:type="spellEnd"/>
-            <w:r>
-              <w:rPr>
-                <w:highlight w:val="yellow"/>
-              </w:rPr>
-              <w:t xml:space="preserve">, </w:t>
-            </w:r>
-            <w:proofErr w:type="spellStart"/>
-            <w:r>
-              <w:rPr>
-                <w:highlight w:val="yellow"/>
-              </w:rPr>
-              <w:t>sp_RefillAllBins</w:t>
-            </w:r>
-            <w:proofErr w:type="spellEnd"/>
-            <w:r>
-              <w:t xml:space="preserve">) and created the </w:t>
-            </w:r>
-            <w:proofErr w:type="spellStart"/>
-            <w:r>
-              <w:rPr>
-                <w:highlight w:val="yellow"/>
-              </w:rPr>
-              <w:t>trg_LowStockAlert</w:t>
-            </w:r>
-            <w:proofErr w:type="spellEnd"/>
-            <w:r>
-              <w:t xml:space="preserve"> trigger to automatically notify runners when bin quantities fall below the threshold.</w:t>
-            </w:r>
-          </w:p>
-        </w:tc>
-      </w:tr>
-      <w:tr>
-        <w:tc>
-          <w:tcPr>
-            <w:tcW w:w="2337" w:type="dxa"/>
-          </w:tcPr>
-          <w:p>
-            <w:pPr>
-              <w:jc w:val="both"/>
-            </w:pPr>
-            <w:r>
-              <w:t xml:space="preserve">7.Configuration </w:t>
-            </w:r>
-            <w:proofErr w:type="gramStart"/>
-            <w:r>
-              <w:t>Tool(</w:t>
-            </w:r>
-            <w:proofErr w:type="gramEnd"/>
-            <w:r>
-              <w:t>WPF&amp;ADO.NET)</w:t>
-            </w:r>
-          </w:p>
-        </w:tc>
-        <w:tc>
-          <w:tcPr>
-            <w:tcW w:w="2337" w:type="dxa"/>
-          </w:tcPr>
-          <w:p>
-            <w:r>
-              <w:t>Burhan and Tuan</w:t>
-            </w:r>
-          </w:p>
-        </w:tc>
-        <w:tc>
-          <w:tcPr>
-            <w:tcW w:w="2338" w:type="dxa"/>
-          </w:tcPr>
-          <w:p>
-            <w:r>
-              <w:t>Mar 26, 2026</w:t>
-            </w:r>
-          </w:p>
-        </w:tc>
-        <w:tc>
-          <w:tcPr>
-            <w:tcW w:w="2338" w:type="dxa"/>
-          </w:tcPr>
-          <w:p>
-            <w:r>
-              <w:t>Built the WPF Configuration Tool (</w:t>
-            </w:r>
-            <w:proofErr w:type="spellStart"/>
-            <w:r>
-              <w:rPr>
-                <w:highlight w:val="yellow"/>
-              </w:rPr>
-              <w:t>MainWindow.xaml</w:t>
-            </w:r>
-            <w:proofErr w:type="spellEnd"/>
-            <w:r>
-              <w:t xml:space="preserve">). Implemented the C# code-behind using </w:t>
-            </w:r>
-            <w:proofErr w:type="spellStart"/>
-            <w:r>
-              <w:rPr>
-                <w:highlight w:val="yellow"/>
-              </w:rPr>
-              <w:t>SqlDataAdapter</w:t>
-            </w:r>
-            <w:proofErr w:type="spellEnd"/>
-            <w:r>
-              <w:t xml:space="preserve"> and </w:t>
-            </w:r>
-            <w:proofErr w:type="spellStart"/>
-            <w:r>
-              <w:rPr>
-                <w:highlight w:val="yellow"/>
-              </w:rPr>
-              <w:t>SqlCommandBuilder</w:t>
-            </w:r>
-            <w:proofErr w:type="spellEnd"/>
-            <w:r>
-              <w:t xml:space="preserve"> to allow dynamic updates to simulation parameters. Added a "Reset Simulation" feature that safely calls </w:t>
-            </w:r>
-            <w:proofErr w:type="spellStart"/>
-            <w:r>
-              <w:rPr>
-                <w:highlight w:val="yellow"/>
-              </w:rPr>
-              <w:t>sp_ResetSimulation</w:t>
-            </w:r>
-            <w:proofErr w:type="spellEnd"/>
-            <w:r>
-              <w:t>.</w:t>
-            </w:r>
-          </w:p>
-        </w:tc>
-      </w:tr>
-      <w:tr>
-        <w:tc>
-          <w:tcPr>
-            <w:tcW w:w="2337" w:type="dxa"/>
-          </w:tcPr>
-          <w:p>
-            <w:r>
-              <w:t>8.</w:t>
-            </w:r>
-            <w:r>
-              <w:t xml:space="preserve"> </w:t>
-            </w:r>
-            <w:r>
-              <w:t>Simulation Engine Architecture (WPF)</w:t>
-            </w:r>
-          </w:p>
-        </w:tc>
-        <w:tc>
-          <w:tcPr>
-            <w:tcW w:w="2337" w:type="dxa"/>
-          </w:tcPr>
-          <w:p>
-            <w:r>
-              <w:t xml:space="preserve">Burhan and Tuan </w:t>
-            </w:r>
-          </w:p>
-        </w:tc>
-        <w:tc>
-          <w:tcPr>
-            <w:tcW w:w="2338" w:type="dxa"/>
-          </w:tcPr>
-          <w:p>
-            <w:r>
-              <w:t>Mar 26, 2026</w:t>
-            </w:r>
-          </w:p>
-        </w:tc>
-        <w:tc>
-          <w:tcPr>
-            <w:tcW w:w="2338" w:type="dxa"/>
-          </w:tcPr>
-          <w:p>
-            <w:r>
-              <w:t xml:space="preserve">Developed the Workstation Simulation as a WPF application. Implemented the </w:t>
-            </w:r>
-            <w:proofErr w:type="spellStart"/>
-            <w:r>
-              <w:rPr>
-                <w:highlight w:val="yellow"/>
-              </w:rPr>
-              <w:t>LoadStations</w:t>
-            </w:r>
-            <w:proofErr w:type="spellEnd"/>
-            <w:r>
-              <w:t xml:space="preserve"> method to populate the UI </w:t>
-            </w:r>
-            <w:proofErr w:type="spellStart"/>
-            <w:r>
-              <w:rPr>
-                <w:highlight w:val="yellow"/>
-              </w:rPr>
-              <w:t>ComboBox</w:t>
-            </w:r>
-            <w:proofErr w:type="spellEnd"/>
-            <w:r>
-              <w:t xml:space="preserve"> dynamically from the database, allowing multiple independent simulation </w:t>
-            </w:r>
-            <w:r>
-              <w:lastRenderedPageBreak/>
-              <w:t>instances to be launched simultaneously.</w:t>
-            </w:r>
-          </w:p>
-        </w:tc>
-      </w:tr>
-      <w:tr>
-        <w:tc>
-          <w:tcPr>
-            <w:tcW w:w="2337" w:type="dxa"/>
-          </w:tcPr>
-          <w:p>
-            <w:r>
-              <w:lastRenderedPageBreak/>
-              <w:t xml:space="preserve">9. </w:t>
-            </w:r>
-            <w:r>
-              <w:t>Multithreading &amp; Timing Logic</w:t>
-            </w:r>
-          </w:p>
-        </w:tc>
-        <w:tc>
-          <w:tcPr>
-            <w:tcW w:w="2337" w:type="dxa"/>
-          </w:tcPr>
-          <w:p>
-            <w:r>
-              <w:t>Tuan and Burhan</w:t>
-            </w:r>
-          </w:p>
-        </w:tc>
-        <w:tc>
-          <w:tcPr>
-            <w:tcW w:w="2338" w:type="dxa"/>
-          </w:tcPr>
-          <w:p>
-            <w:r>
-              <w:t>Mar 26, 2026</w:t>
-            </w:r>
-          </w:p>
-        </w:tc>
-        <w:tc>
-          <w:tcPr>
-            <w:tcW w:w="2338" w:type="dxa"/>
-          </w:tcPr>
-          <w:p>
-            <w:r>
-              <w:t>Engineered the background simulation thread (</w:t>
-            </w:r>
-            <w:proofErr w:type="spellStart"/>
-            <w:r>
-              <w:rPr>
-                <w:highlight w:val="yellow"/>
-              </w:rPr>
-              <w:t>SimulationLoop</w:t>
-            </w:r>
-            <w:proofErr w:type="spellEnd"/>
-            <w:r>
-              <w:t xml:space="preserve">). Integrated the </w:t>
-            </w:r>
-            <w:proofErr w:type="spellStart"/>
-            <w:r>
-              <w:rPr>
-                <w:highlight w:val="yellow"/>
-              </w:rPr>
-              <w:t>TimeScaleMultiplier</w:t>
-            </w:r>
-            <w:proofErr w:type="spellEnd"/>
-            <w:r>
-              <w:t xml:space="preserve"> from the configuration table to accurately scale </w:t>
-            </w:r>
-            <w:proofErr w:type="spellStart"/>
-            <w:r>
-              <w:rPr>
-                <w:highlight w:val="yellow"/>
-              </w:rPr>
-              <w:t>Thread.Sleep</w:t>
-            </w:r>
-            <w:proofErr w:type="spellEnd"/>
-            <w:r>
-              <w:rPr>
-                <w:highlight w:val="yellow"/>
-              </w:rPr>
-              <w:t>() delays</w:t>
-            </w:r>
-            <w:r>
-              <w:t>, ensuring the 60-second (+/- 10%) assembly time requirement is met without freezing the UI thread.</w:t>
-            </w:r>
-          </w:p>
-        </w:tc>
-      </w:tr>
-      <w:tr>
-        <w:tc>
-          <w:tcPr>
-            <w:tcW w:w="2337" w:type="dxa"/>
-          </w:tcPr>
-          <w:p>
-            <w:r>
-              <w:t xml:space="preserve">10. </w:t>
-            </w:r>
-            <w:r>
-              <w:t>Data Access &amp; UI Dispatching</w:t>
-            </w:r>
-          </w:p>
-        </w:tc>
-        <w:tc>
-          <w:tcPr>
-            <w:tcW w:w="2337" w:type="dxa"/>
-          </w:tcPr>
-          <w:p>
-            <w:r>
-              <w:t>Tuan and Burhan</w:t>
-            </w:r>
-          </w:p>
-        </w:tc>
-        <w:tc>
-          <w:tcPr>
-            <w:tcW w:w="2338" w:type="dxa"/>
-          </w:tcPr>
-          <w:p>
-            <w:r>
-              <w:t>Mar 26, 2026</w:t>
-            </w:r>
-          </w:p>
-        </w:tc>
-        <w:tc>
-          <w:tcPr>
-            <w:tcW w:w="2338" w:type="dxa"/>
-          </w:tcPr>
-          <w:p>
-            <w:r>
-              <w:t xml:space="preserve">Finalized the connection between the C# simulation and the SQL database. Used </w:t>
-            </w:r>
-            <w:proofErr w:type="spellStart"/>
-            <w:r>
-              <w:rPr>
-                <w:highlight w:val="yellow"/>
-              </w:rPr>
-              <w:t>SqlCommand</w:t>
-            </w:r>
-            <w:proofErr w:type="spellEnd"/>
-            <w:r>
-              <w:t xml:space="preserve"> to execute </w:t>
-            </w:r>
-            <w:proofErr w:type="spellStart"/>
-            <w:r>
-              <w:rPr>
-                <w:highlight w:val="yellow"/>
-              </w:rPr>
-              <w:t>sp_BuildLamp</w:t>
-            </w:r>
-            <w:proofErr w:type="spellEnd"/>
             <w:r>
               <w:t xml:space="preserve"> and capture output parameters (Pass/Fail status). Implemented </w:t>
             </w:r>
-            <w:proofErr w:type="spellStart"/>
             <w:r>
               <w:rPr>
                 <w:highlight w:val="yellow"/>
               </w:rPr>
               <w:t>Dispatcher.Invoke</w:t>
             </w:r>
-            <w:proofErr w:type="spellEnd"/>
             <w:r>
               <w:t xml:space="preserve"> to safely update the WPF UI with real-time build statistics.</w:t>
+            </w:r>
+          </w:p>
+        </w:tc>
+      </w:tr>
+    </w:tbl>
+    <w:p>
+      <w:pPr>
+        <w:pStyle w:val="Heading1"/>
+        <w:rPr>
+          <w:b/>
+          <w:bCs/>
+        </w:rPr>
+      </w:pPr>
+      <w:r>
+        <w:rPr>
+          <w:b/>
+          <w:bCs/>
+        </w:rPr>
+        <w:t>Final Deliverables</w:t>
+      </w:r>
+      <w:r>
+        <w:rPr>
+          <w:b/>
+          <w:bCs/>
+        </w:rPr>
+        <w:t>:</w:t>
+      </w:r>
+    </w:p>
+    <w:p/>
+    <w:tbl>
+      <w:tblPr>
+        <w:tblStyle w:val="TableGrid"/>
+        <w:tblW w:w="10060" w:type="dxa"/>
+        <w:tblLook w:val="04A0" w:firstRow="1" w:lastRow="0" w:firstColumn="1" w:lastColumn="0" w:noHBand="0" w:noVBand="1"/>
+      </w:tblPr>
+      <w:tblGrid>
+        <w:gridCol w:w="2096"/>
+        <w:gridCol w:w="1798"/>
+        <w:gridCol w:w="1825"/>
+        <w:gridCol w:w="4341"/>
+      </w:tblGrid>
+      <w:tr>
+        <w:tc>
+          <w:tcPr>
+            <w:tcW w:w="2096" w:type="dxa"/>
+          </w:tcPr>
+          <w:p>
+            <w:r>
+              <w:t>Description</w:t>
+            </w:r>
+          </w:p>
+        </w:tc>
+        <w:tc>
+          <w:tcPr>
+            <w:tcW w:w="1798" w:type="dxa"/>
+          </w:tcPr>
+          <w:p>
+            <w:r>
+              <w:t>Team Member</w:t>
+            </w:r>
+          </w:p>
+        </w:tc>
+        <w:tc>
+          <w:tcPr>
+            <w:tcW w:w="1825" w:type="dxa"/>
+          </w:tcPr>
+          <w:p>
+            <w:r>
+              <w:t>Date &amp; Time Completed</w:t>
+            </w:r>
+          </w:p>
+        </w:tc>
+        <w:tc>
+          <w:tcPr>
+            <w:tcW w:w="4341" w:type="dxa"/>
+          </w:tcPr>
+          <w:p>
+            <w:r>
+              <w:t xml:space="preserve">Contribution </w:t>
+            </w:r>
+          </w:p>
+        </w:tc>
+      </w:tr>
+      <w:tr>
+        <w:tc>
+          <w:tcPr>
+            <w:tcW w:w="2096" w:type="dxa"/>
+          </w:tcPr>
+          <w:p>
+            <w:r>
+              <w:t xml:space="preserve">11. </w:t>
+            </w:r>
+            <w:r>
+              <w:t>Scalar Functions</w:t>
+            </w:r>
+          </w:p>
+        </w:tc>
+        <w:tc>
+          <w:tcPr>
+            <w:tcW w:w="1798" w:type="dxa"/>
+          </w:tcPr>
+          <w:p>
+            <w:r>
+              <w:t>Burhan Shibli</w:t>
+            </w:r>
+          </w:p>
+        </w:tc>
+        <w:tc>
+          <w:tcPr>
+            <w:tcW w:w="1825" w:type="dxa"/>
+          </w:tcPr>
+          <w:p>
+            <w:r>
+              <w:t>Mar</w:t>
+            </w:r>
+            <w:r>
+              <w:t xml:space="preserve"> 29</w:t>
+            </w:r>
+            <w:r>
+              <w:t>, 2026 - 2:00 PM</w:t>
+            </w:r>
+          </w:p>
+        </w:tc>
+        <w:tc>
+          <w:tcPr>
+            <w:tcW w:w="4341" w:type="dxa"/>
+          </w:tcPr>
+          <w:p>
+            <w:pPr>
+              <w:pStyle w:val="ListParagraph"/>
+              <w:numPr>
+                <w:ilvl w:val="0"/>
+                <w:numId w:val="1"/>
+              </w:numPr>
+            </w:pPr>
+            <w:r>
+              <w:t xml:space="preserve">Wrote </w:t>
+            </w:r>
+            <w:r>
+              <w:rPr>
+                <w:highlight w:val="yellow"/>
+              </w:rPr>
+              <w:t>fn_GetConfigValue</w:t>
+            </w:r>
+            <w:r>
+              <w:t xml:space="preserve"> (generic config lookup by name), </w:t>
+            </w:r>
+            <w:r>
+              <w:rPr>
+                <w:highlight w:val="yellow"/>
+              </w:rPr>
+              <w:t>fn_GetBuildTime</w:t>
+            </w:r>
+            <w:r>
+              <w:t xml:space="preserve"> (calculates per-worker build time with plus/minus 10% variance; uses </w:t>
+            </w:r>
+            <w:r>
+              <w:rPr>
+                <w:highlight w:val="yellow"/>
+              </w:rPr>
+              <w:t>CHECKSUM(NEWID()</w:t>
+            </w:r>
+            <w:r>
+              <w:t xml:space="preserve">) instead of </w:t>
+            </w:r>
+            <w:r>
+              <w:rPr>
+                <w:highlight w:val="yellow"/>
+              </w:rPr>
+              <w:t>RAND()</w:t>
+            </w:r>
+            <w:r>
+              <w:t xml:space="preserve"> to guarantee a fresh </w:t>
+            </w:r>
+            <w:r>
+              <w:lastRenderedPageBreak/>
+              <w:t xml:space="preserve">random seed on every call within the same batch), </w:t>
+            </w:r>
+          </w:p>
+          <w:p>
+            <w:pPr>
+              <w:pStyle w:val="ListParagraph"/>
+              <w:numPr>
+                <w:ilvl w:val="0"/>
+                <w:numId w:val="1"/>
+              </w:numPr>
+            </w:pPr>
+            <w:r>
+              <w:rPr>
+                <w:highlight w:val="yellow"/>
+              </w:rPr>
+              <w:t>fn_GetDefectRate</w:t>
+            </w:r>
+            <w:r>
+              <w:t xml:space="preserve"> (maps Rookie/Normal/Super skill level to the configured defect probability).</w:t>
+            </w:r>
+          </w:p>
+        </w:tc>
+      </w:tr>
+      <w:tr>
+        <w:tc>
+          <w:tcPr>
+            <w:tcW w:w="2096" w:type="dxa"/>
+          </w:tcPr>
+          <w:p>
+            <w:r>
+              <w:lastRenderedPageBreak/>
+              <w:t xml:space="preserve">12. </w:t>
+            </w:r>
+            <w:r>
+              <w:t>Database Views</w:t>
+            </w:r>
+          </w:p>
+        </w:tc>
+        <w:tc>
+          <w:tcPr>
+            <w:tcW w:w="1798" w:type="dxa"/>
+          </w:tcPr>
+          <w:p>
+            <w:r>
+              <w:t>Tuan Thanh Nguyen</w:t>
+            </w:r>
+          </w:p>
+        </w:tc>
+        <w:tc>
+          <w:tcPr>
+            <w:tcW w:w="1825" w:type="dxa"/>
+          </w:tcPr>
+          <w:p>
+            <w:r>
+              <w:t>Mar 29, 2026 – 4:30 PM</w:t>
+            </w:r>
+          </w:p>
+        </w:tc>
+        <w:tc>
+          <w:tcPr>
+            <w:tcW w:w="4341" w:type="dxa"/>
+          </w:tcPr>
+          <w:p>
+            <w:r>
+              <w:t xml:space="preserve">Created three views: </w:t>
+            </w:r>
+          </w:p>
+          <w:p>
+            <w:pPr>
+              <w:pStyle w:val="ListParagraph"/>
+              <w:numPr>
+                <w:ilvl w:val="0"/>
+                <w:numId w:val="2"/>
+              </w:numPr>
+            </w:pPr>
+            <w:r>
+              <w:rPr>
+                <w:highlight w:val="yellow"/>
+              </w:rPr>
+              <w:t>vw_WorkstationStatus</w:t>
+            </w:r>
+            <w:r>
+              <w:t xml:space="preserve"> (joins Workstation, Worker, WorkstationBin, and Part to expose each bin's quantity and low-stock flag per station), </w:t>
+            </w:r>
+          </w:p>
+          <w:p>
+            <w:pPr>
+              <w:pStyle w:val="ListParagraph"/>
+              <w:numPr>
+                <w:ilvl w:val="0"/>
+                <w:numId w:val="2"/>
+              </w:numPr>
+            </w:pPr>
+            <w:r>
+              <w:rPr>
+                <w:highlight w:val="yellow"/>
+              </w:rPr>
+              <w:t>vw_ProductionSummary</w:t>
+            </w:r>
+            <w:r>
+              <w:t xml:space="preserve"> (aggregates ProductionLog for Kanban tiles: orderAmount, inProgress, totalProduced, totalPassed, totalFailed, yieldPercent, remainingOrder) </w:t>
+            </w:r>
+          </w:p>
+          <w:p>
+            <w:pPr>
+              <w:pStyle w:val="ListParagraph"/>
+              <w:numPr>
+                <w:ilvl w:val="0"/>
+                <w:numId w:val="2"/>
+              </w:numPr>
+            </w:pPr>
+            <w:r>
+              <w:rPr>
+                <w:highlight w:val="yellow"/>
+              </w:rPr>
+              <w:t>vw_ActiveAlerts</w:t>
+            </w:r>
+            <w:r>
+              <w:t xml:space="preserve"> (surfaces unresolved LowStockAlert rows with station and part detail for the runner display).</w:t>
+            </w:r>
+          </w:p>
+        </w:tc>
+      </w:tr>
+      <w:tr>
+        <w:tc>
+          <w:tcPr>
+            <w:tcW w:w="2096" w:type="dxa"/>
+          </w:tcPr>
+          <w:p>
+            <w:r>
+              <w:t xml:space="preserve">13. </w:t>
+            </w:r>
+            <w:r>
+              <w:t>Trigger — trg_LowStockAlert</w:t>
+            </w:r>
+          </w:p>
+        </w:tc>
+        <w:tc>
+          <w:tcPr>
+            <w:tcW w:w="1798" w:type="dxa"/>
+          </w:tcPr>
+          <w:p>
+            <w:r>
+              <w:t>Burhan Shibli</w:t>
+            </w:r>
+          </w:p>
+        </w:tc>
+        <w:tc>
+          <w:tcPr>
+            <w:tcW w:w="1825" w:type="dxa"/>
+          </w:tcPr>
+          <w:p>
+            <w:r>
+              <w:t>Mar 30, 2026 – 1:00 PM</w:t>
+            </w:r>
+          </w:p>
+        </w:tc>
+        <w:tc>
+          <w:tcPr>
+            <w:tcW w:w="4341" w:type="dxa"/>
+          </w:tcPr>
+          <w:p>
+            <w:r>
+              <w:t>Implemented an AFTER UPDATE trigger on WorkstationBin. On every bin decrement it reads the LowStockThreshold from Configuration and inserts one alert row per affected bin only when no unresolved alert already exists for that station/part combination, preventing duplicate alerts.</w:t>
+            </w:r>
+          </w:p>
+        </w:tc>
+      </w:tr>
+      <w:tr>
+        <w:tc>
+          <w:tcPr>
+            <w:tcW w:w="2096" w:type="dxa"/>
+          </w:tcPr>
+          <w:p>
+            <w:r>
+              <w:t xml:space="preserve">14. </w:t>
+            </w:r>
+            <w:r>
+              <w:t>Stored Procedures</w:t>
+            </w:r>
+            <w:r>
+              <w:t xml:space="preserve">, </w:t>
+            </w:r>
+            <w:r>
+              <w:t>Core Refill and Reset</w:t>
+            </w:r>
+          </w:p>
+        </w:tc>
+        <w:tc>
+          <w:tcPr>
+            <w:tcW w:w="1798" w:type="dxa"/>
+          </w:tcPr>
+          <w:p>
+            <w:r>
+              <w:t>Tuan Thanh Nguyen</w:t>
+            </w:r>
+          </w:p>
+        </w:tc>
+        <w:tc>
+          <w:tcPr>
+            <w:tcW w:w="1825" w:type="dxa"/>
+          </w:tcPr>
+          <w:p>
+            <w:r>
+              <w:t>Mar 30, 2026 – 5:15 PM</w:t>
+            </w:r>
+          </w:p>
+        </w:tc>
+        <w:tc>
+          <w:tcPr>
+            <w:tcW w:w="4341" w:type="dxa"/>
+          </w:tcPr>
+          <w:p>
+            <w:r>
+              <w:t xml:space="preserve">Wrote </w:t>
+            </w:r>
+          </w:p>
+          <w:p>
+            <w:pPr>
+              <w:pStyle w:val="ListParagraph"/>
+              <w:numPr>
+                <w:ilvl w:val="0"/>
+                <w:numId w:val="3"/>
+              </w:numPr>
+            </w:pPr>
+            <w:r>
+              <w:t xml:space="preserve">sp_RefillBin (refills one bin to its defaultCapacity and resolves its alert) </w:t>
+            </w:r>
+          </w:p>
+          <w:p>
+            <w:pPr>
+              <w:pStyle w:val="ListParagraph"/>
+              <w:numPr>
+                <w:ilvl w:val="0"/>
+                <w:numId w:val="3"/>
+              </w:numPr>
+            </w:pPr>
+            <w:r>
+              <w:t xml:space="preserve">sp_RefillAllBins (calls sp_RefillBin for every bin at a given station) </w:t>
+            </w:r>
+          </w:p>
+          <w:p>
+            <w:pPr>
+              <w:pStyle w:val="ListParagraph"/>
+              <w:numPr>
+                <w:ilvl w:val="0"/>
+                <w:numId w:val="3"/>
+              </w:numPr>
+            </w:pPr>
+            <w:r>
+              <w:t xml:space="preserve">sp_RefillStock (alias for sp_RefillAllBins) </w:t>
+            </w:r>
+          </w:p>
+          <w:p>
+            <w:pPr>
+              <w:pStyle w:val="ListParagraph"/>
+              <w:numPr>
+                <w:ilvl w:val="0"/>
+                <w:numId w:val="3"/>
+              </w:numPr>
+            </w:pPr>
+            <w:r>
+              <w:t xml:space="preserve">sp_ResetSimulation (truncates ProductionLog and LowStockAlert and refills all bins </w:t>
+            </w:r>
+            <w:r>
+              <w:lastRenderedPageBreak/>
+              <w:t>to restore a clean simulation state).</w:t>
+            </w:r>
+          </w:p>
+        </w:tc>
+      </w:tr>
+      <w:tr>
+        <w:tc>
+          <w:tcPr>
+            <w:tcW w:w="2096" w:type="dxa"/>
+          </w:tcPr>
+          <w:p>
+            <w:r>
+              <w:lastRenderedPageBreak/>
+              <w:t xml:space="preserve">15. </w:t>
+            </w:r>
+            <w:r>
+              <w:t>Stored Procedure</w:t>
+            </w:r>
+            <w:r>
+              <w:t xml:space="preserve">, </w:t>
+            </w:r>
+            <w:r>
+              <w:t>sp_BuildLamp</w:t>
+            </w:r>
+          </w:p>
+        </w:tc>
+        <w:tc>
+          <w:tcPr>
+            <w:tcW w:w="1798" w:type="dxa"/>
+          </w:tcPr>
+          <w:p>
+            <w:r>
+              <w:t>Tuan Thanh Nguyen</w:t>
+            </w:r>
+          </w:p>
+        </w:tc>
+        <w:tc>
+          <w:tcPr>
+            <w:tcW w:w="1825" w:type="dxa"/>
+          </w:tcPr>
+          <w:p>
+            <w:r>
+              <w:t>Mar 31, 2026 – 4:00 PM</w:t>
+            </w:r>
+          </w:p>
+        </w:tc>
+        <w:tc>
+          <w:tcPr>
+            <w:tcW w:w="4341" w:type="dxa"/>
+          </w:tcPr>
+          <w:p>
+            <w:r>
+              <w:t>Implemented sp_BuildLamp: checks all six bins for the station (blocks and sets status = Blocked if any are empty), retrieves the assigned worker and skill, generates random build time and QA result via CHECKSUM(NEWID()), decrements all six bins, inserts a ProductionLog row with isComplete = 0, and returns build time, QA result, built flag, and logID as OUTPUT parameters.</w:t>
+            </w:r>
+          </w:p>
+        </w:tc>
+      </w:tr>
+    </w:tbl>
+    <w:p/>
+    <w:tbl>
+      <w:tblPr>
+        <w:tblStyle w:val="TableGrid"/>
+        <w:tblW w:w="10060" w:type="dxa"/>
+        <w:tblLook w:val="04A0" w:firstRow="1" w:lastRow="0" w:firstColumn="1" w:lastColumn="0" w:noHBand="0" w:noVBand="1"/>
+      </w:tblPr>
+      <w:tblGrid>
+        <w:gridCol w:w="2373"/>
+        <w:gridCol w:w="1450"/>
+        <w:gridCol w:w="1842"/>
+        <w:gridCol w:w="4395"/>
+      </w:tblGrid>
+      <w:tr>
+        <w:tc>
+          <w:tcPr>
+            <w:tcW w:w="2373" w:type="dxa"/>
+          </w:tcPr>
+          <w:p>
+            <w:r>
+              <w:t>Description</w:t>
+            </w:r>
+          </w:p>
+        </w:tc>
+        <w:tc>
+          <w:tcPr>
+            <w:tcW w:w="1450" w:type="dxa"/>
+          </w:tcPr>
+          <w:p>
+            <w:r>
+              <w:t xml:space="preserve">Team Member </w:t>
+            </w:r>
+          </w:p>
+        </w:tc>
+        <w:tc>
+          <w:tcPr>
+            <w:tcW w:w="1842" w:type="dxa"/>
+          </w:tcPr>
+          <w:p>
+            <w:r>
+              <w:t>Date &amp; Time Completed</w:t>
+            </w:r>
+          </w:p>
+        </w:tc>
+        <w:tc>
+          <w:tcPr>
+            <w:tcW w:w="4395" w:type="dxa"/>
+          </w:tcPr>
+          <w:p>
+            <w:r>
+              <w:t>Contribution</w:t>
+            </w:r>
+          </w:p>
+        </w:tc>
+      </w:tr>
+      <w:tr>
+        <w:tc>
+          <w:tcPr>
+            <w:tcW w:w="2373" w:type="dxa"/>
+          </w:tcPr>
+          <w:p>
+            <w:r>
+              <w:t xml:space="preserve">16. </w:t>
+            </w:r>
+            <w:r>
+              <w:t>Stored Procedures — sp_CompleteLamp and sp_CancelLamp</w:t>
+            </w:r>
+          </w:p>
+        </w:tc>
+        <w:tc>
+          <w:tcPr>
+            <w:tcW w:w="1450" w:type="dxa"/>
+          </w:tcPr>
+          <w:p>
+            <w:r>
+              <w:t>Burhan and Tuan</w:t>
+            </w:r>
+          </w:p>
+        </w:tc>
+        <w:tc>
+          <w:tcPr>
+            <w:tcW w:w="1842" w:type="dxa"/>
+          </w:tcPr>
+          <w:p>
+            <w:r>
+              <w:t xml:space="preserve">Mar </w:t>
+            </w:r>
+            <w:r>
+              <w:t>31</w:t>
+            </w:r>
+            <w:r>
+              <w:t>, 2026</w:t>
+            </w:r>
+          </w:p>
+        </w:tc>
+        <w:tc>
+          <w:tcPr>
+            <w:tcW w:w="4395" w:type="dxa"/>
+          </w:tcPr>
+          <w:p>
+            <w:r>
+              <w:t xml:space="preserve">Added </w:t>
+            </w:r>
+          </w:p>
+          <w:p>
+            <w:pPr>
+              <w:pStyle w:val="ListParagraph"/>
+              <w:numPr>
+                <w:ilvl w:val="0"/>
+                <w:numId w:val="4"/>
+              </w:numPr>
+            </w:pPr>
+            <w:r>
+              <w:rPr>
+                <w:highlight w:val="yellow"/>
+              </w:rPr>
+              <w:t>sp_CompleteLamp</w:t>
+            </w:r>
+            <w:r>
+              <w:t xml:space="preserve"> (sets isComplete = 1 for a given logID when the simulated assembly duration elapses)  </w:t>
+            </w:r>
+          </w:p>
+          <w:p>
+            <w:pPr>
+              <w:pStyle w:val="ListParagraph"/>
+            </w:pPr>
+          </w:p>
+          <w:p>
+            <w:pPr>
+              <w:pStyle w:val="ListParagraph"/>
+              <w:numPr>
+                <w:ilvl w:val="0"/>
+                <w:numId w:val="4"/>
+              </w:numPr>
+            </w:pPr>
+            <w:r>
+              <w:rPr>
+                <w:highlight w:val="yellow"/>
+              </w:rPr>
+              <w:t>sp_CancelLamp</w:t>
+            </w:r>
+            <w:r>
+              <w:t xml:space="preserve"> (deletes the in-progress row when Stop is pressed mid-build, guarded by isComplete = 0 to prevent accidental removal of finished records). These two procedures power the accurate Producing vs Produced split in the Kanban board.</w:t>
+            </w:r>
+          </w:p>
+        </w:tc>
+      </w:tr>
+      <w:tr>
+        <w:tc>
+          <w:tcPr>
+            <w:tcW w:w="2373" w:type="dxa"/>
+          </w:tcPr>
+          <w:p>
+            <w:pPr>
+              <w:jc w:val="both"/>
+            </w:pPr>
+            <w:r>
+              <w:t>17.</w:t>
+            </w:r>
+            <w:r>
+              <w:t xml:space="preserve"> </w:t>
+            </w:r>
+            <w:r>
+              <w:t>Non-Clustered Indices</w:t>
+            </w:r>
+          </w:p>
+        </w:tc>
+        <w:tc>
+          <w:tcPr>
+            <w:tcW w:w="1450" w:type="dxa"/>
+          </w:tcPr>
+          <w:p>
+            <w:r>
+              <w:t>Burhan and Tuan</w:t>
+            </w:r>
+          </w:p>
+        </w:tc>
+        <w:tc>
+          <w:tcPr>
+            <w:tcW w:w="1842" w:type="dxa"/>
+          </w:tcPr>
+          <w:p>
+            <w:r>
+              <w:t>Apr 2</w:t>
+            </w:r>
+            <w:r>
+              <w:t>, 2026</w:t>
+            </w:r>
+          </w:p>
+        </w:tc>
+        <w:tc>
+          <w:tcPr>
+            <w:tcW w:w="4395" w:type="dxa"/>
+          </w:tcPr>
+          <w:p>
+            <w:r>
+              <w:t>Added five non-clustered indices to support query patterns across all display applications:</w:t>
+            </w:r>
+          </w:p>
+          <w:p>
+            <w:pPr>
+              <w:pStyle w:val="ListParagraph"/>
+              <w:numPr>
+                <w:ilvl w:val="0"/>
+                <w:numId w:val="5"/>
+              </w:numPr>
+            </w:pPr>
+            <w:r>
+              <w:t xml:space="preserve">IX_ProductionLog_StationID, </w:t>
+            </w:r>
+          </w:p>
+          <w:p>
+            <w:pPr>
+              <w:pStyle w:val="ListParagraph"/>
+              <w:numPr>
+                <w:ilvl w:val="0"/>
+                <w:numId w:val="5"/>
+              </w:numPr>
+            </w:pPr>
+            <w:r>
+              <w:t xml:space="preserve">IX_ProductionLog_Timestamp, </w:t>
+            </w:r>
+          </w:p>
+          <w:p>
+            <w:pPr>
+              <w:pStyle w:val="ListParagraph"/>
+              <w:numPr>
+                <w:ilvl w:val="0"/>
+                <w:numId w:val="5"/>
+              </w:numPr>
+            </w:pPr>
+            <w:r>
+              <w:t xml:space="preserve">IX_ProductionLog_PassedQA (on ProductionLog), </w:t>
+            </w:r>
+          </w:p>
+          <w:p>
+            <w:pPr>
+              <w:pStyle w:val="ListParagraph"/>
+              <w:numPr>
+                <w:ilvl w:val="0"/>
+                <w:numId w:val="5"/>
+              </w:numPr>
+            </w:pPr>
+            <w:r>
+              <w:t xml:space="preserve">IX_WorkstationBin_StationID (on WorkstationBin) </w:t>
+            </w:r>
+          </w:p>
+          <w:p>
+            <w:pPr>
+              <w:pStyle w:val="ListParagraph"/>
+              <w:numPr>
+                <w:ilvl w:val="0"/>
+                <w:numId w:val="5"/>
+              </w:numPr>
+            </w:pPr>
+            <w:r>
+              <w:t xml:space="preserve">IX_LowStockAlert_Unresolved (filtered WHERE isResolved = 0 </w:t>
+            </w:r>
+            <w:r>
+              <w:lastRenderedPageBreak/>
+              <w:t>on LowStockAlert) to accelerate the runner alert query.</w:t>
+            </w:r>
+          </w:p>
+        </w:tc>
+      </w:tr>
+      <w:tr>
+        <w:tc>
+          <w:tcPr>
+            <w:tcW w:w="2373" w:type="dxa"/>
+          </w:tcPr>
+          <w:p>
+            <w:r>
+              <w:lastRenderedPageBreak/>
+              <w:t>18.</w:t>
+            </w:r>
+            <w:r>
+              <w:t xml:space="preserve"> </w:t>
+            </w:r>
+            <w:r>
+              <w:t>WPF Configuration Tool</w:t>
+            </w:r>
+          </w:p>
+        </w:tc>
+        <w:tc>
+          <w:tcPr>
+            <w:tcW w:w="1450" w:type="dxa"/>
+          </w:tcPr>
+          <w:p>
+            <w:r>
+              <w:t xml:space="preserve">Burhan and Tuan </w:t>
+            </w:r>
+          </w:p>
+        </w:tc>
+        <w:tc>
+          <w:tcPr>
+            <w:tcW w:w="1842" w:type="dxa"/>
+          </w:tcPr>
+          <w:p>
+            <w:r>
+              <w:t>Apr 2</w:t>
+            </w:r>
+            <w:r>
+              <w:t>, 2026</w:t>
+            </w:r>
+          </w:p>
+        </w:tc>
+        <w:tc>
+          <w:tcPr>
+            <w:tcW w:w="4395" w:type="dxa"/>
+          </w:tcPr>
+          <w:p>
+            <w:r>
+              <w:t>Built the ConfigurationTool WPF application using SqlDataAdapter and SqlCommandBuilder (disconnected model). Loads all Configuration rows into a DataGrid for in-place editing; a Save button calls Update() to write changes back. Provides runtime control over all simulation parameters without touching the database directly.</w:t>
+            </w:r>
+          </w:p>
+        </w:tc>
+      </w:tr>
+      <w:tr>
+        <w:tc>
+          <w:tcPr>
+            <w:tcW w:w="2373" w:type="dxa"/>
+          </w:tcPr>
+          <w:p>
+            <w:r>
+              <w:t xml:space="preserve">19. </w:t>
+            </w:r>
+            <w:r>
+              <w:t>WPF Workstation Andon Display</w:t>
+            </w:r>
+          </w:p>
+        </w:tc>
+        <w:tc>
+          <w:tcPr>
+            <w:tcW w:w="1450" w:type="dxa"/>
+          </w:tcPr>
+          <w:p>
+            <w:r>
+              <w:t>Tuan Thanh Nguyen</w:t>
+            </w:r>
+          </w:p>
+        </w:tc>
+        <w:tc>
+          <w:tcPr>
+            <w:tcW w:w="1842" w:type="dxa"/>
+          </w:tcPr>
+          <w:p>
+            <w:r>
+              <w:t>Apr 4, 2026</w:t>
+            </w:r>
+          </w:p>
+        </w:tc>
+        <w:tc>
+          <w:tcPr>
+            <w:tcW w:w="4395" w:type="dxa"/>
+          </w:tcPr>
+          <w:p>
+            <w:r>
+              <w:t>Built the WorkstationAndon WPF application. A DispatcherTimer polls vw_WorkstationStatus every 2 seconds for the selected station. Bin quantities are shown in a DataGrid with a DataTrigger that colours low-stock rows red. A collapsible red RUNNER NEEDED banner appears above the grid whenever any bin is below threshold.</w:t>
+            </w:r>
+          </w:p>
+        </w:tc>
+      </w:tr>
+      <w:tr>
+        <w:tc>
+          <w:tcPr>
+            <w:tcW w:w="2373" w:type="dxa"/>
+          </w:tcPr>
+          <w:p>
+            <w:r>
+              <w:t xml:space="preserve">20. </w:t>
+            </w:r>
+            <w:r>
+              <w:t>WPF Runner Display</w:t>
+            </w:r>
+          </w:p>
+        </w:tc>
+        <w:tc>
+          <w:tcPr>
+            <w:tcW w:w="1450" w:type="dxa"/>
+          </w:tcPr>
+          <w:p>
+            <w:r>
+              <w:t>Tuan Thanh Nguyen</w:t>
+            </w:r>
+          </w:p>
+        </w:tc>
+        <w:tc>
+          <w:tcPr>
+            <w:tcW w:w="1842" w:type="dxa"/>
+          </w:tcPr>
+          <w:p>
+            <w:r>
+              <w:t>Apr 5, 2026</w:t>
+            </w:r>
+          </w:p>
+        </w:tc>
+        <w:tc>
+          <w:tcPr>
+            <w:tcW w:w="4395" w:type="dxa"/>
+          </w:tcPr>
+          <w:p>
+            <w:r>
+              <w:t>Built the RunnerDisplay WPF application. Polls vw_ActiveAlerts every 2 seconds and lists all bins requiring replacement. A colour-coded banner switches between green (all clear) and red (action required). Refill Selected Station and Refill All Stations buttons call sp_RefillAllBins for the appropriate station(s).</w:t>
+            </w:r>
+          </w:p>
+        </w:tc>
+      </w:tr>
+      <w:tr>
+        <w:tc>
+          <w:tcPr>
+            <w:tcW w:w="2373" w:type="dxa"/>
+          </w:tcPr>
+          <w:p>
+            <w:r>
+              <w:t xml:space="preserve">21. </w:t>
+            </w:r>
+            <w:r>
+              <w:t>WPF Assembly Line Kanban Board</w:t>
+            </w:r>
+          </w:p>
+        </w:tc>
+        <w:tc>
+          <w:tcPr>
+            <w:tcW w:w="1450" w:type="dxa"/>
+          </w:tcPr>
+          <w:p>
+            <w:r>
+              <w:t>Tuan Thanh Nguyen</w:t>
+            </w:r>
+          </w:p>
+        </w:tc>
+        <w:tc>
+          <w:tcPr>
+            <w:tcW w:w="1842" w:type="dxa"/>
+          </w:tcPr>
+          <w:p>
+            <w:r>
+              <w:t>Apr 6, 2026</w:t>
+            </w:r>
+          </w:p>
+        </w:tc>
+        <w:tc>
+          <w:tcPr>
+            <w:tcW w:w="4395" w:type="dxa"/>
+          </w:tcPr>
+          <w:p>
+            <w:r>
+              <w:t>Built the AssemblyLineKanban WPF application. Four metric tiles (ORDER, PRODUCING, PRODUCED, YIELD) are driven by vw_ProductionSummary. A per-station DataGrid shows Producing, Produced, Passed, Failed, and Status columns. Blocked stations are highlighted with a light-red row background via DataTrigger.</w:t>
+            </w:r>
+          </w:p>
+        </w:tc>
+      </w:tr>
+      <w:tr>
+        <w:tc>
+          <w:tcPr>
+            <w:tcW w:w="2373" w:type="dxa"/>
+          </w:tcPr>
+          <w:p>
+            <w:r>
+              <w:t xml:space="preserve">22. </w:t>
+            </w:r>
+            <w:r>
+              <w:t>Cycle Stopwatch and Progress Bar</w:t>
+            </w:r>
+          </w:p>
+        </w:tc>
+        <w:tc>
+          <w:tcPr>
+            <w:tcW w:w="1450" w:type="dxa"/>
+          </w:tcPr>
+          <w:p>
+            <w:r>
+              <w:t>Tuan Thanh Nguyen</w:t>
+            </w:r>
+          </w:p>
+        </w:tc>
+        <w:tc>
+          <w:tcPr>
+            <w:tcW w:w="1842" w:type="dxa"/>
+          </w:tcPr>
+          <w:p>
+            <w:r>
+              <w:t>Apr 10, 2026</w:t>
+            </w:r>
+          </w:p>
+        </w:tc>
+        <w:tc>
+          <w:tcPr>
+            <w:tcW w:w="4395" w:type="dxa"/>
+          </w:tcPr>
+          <w:p>
+            <w:r>
+              <w:t xml:space="preserve">Extended WorkstationSimulation with a live cycle stopwatch (Consolas 28pt, M:SS.cc format) and a progress bar that fills green and switches to amber in the final 15 percent of each build. The </w:t>
+            </w:r>
+            <w:r>
+              <w:lastRenderedPageBreak/>
+              <w:t>DispatcherTimer reads volatile fields (buildInProgress, buildDurationMs, buildStartTicks) written by the simulation thread, using Interlocked.Read for the 64-bit tick value to avoid tearing on 32-bit runtimes.</w:t>
+            </w:r>
+          </w:p>
+        </w:tc>
+      </w:tr>
+      <w:tr>
+        <w:tc>
+          <w:tcPr>
+            <w:tcW w:w="2373" w:type="dxa"/>
+          </w:tcPr>
+          <w:p>
+            <w:pPr>
+              <w:tabs>
+                <w:tab w:val="center" w:pos="1078"/>
+              </w:tabs>
+            </w:pPr>
+            <w:r>
+              <w:lastRenderedPageBreak/>
+              <w:t xml:space="preserve">23. </w:t>
+            </w:r>
+            <w:r>
+              <w:t>Simulation Timing Precision Fix</w:t>
+            </w:r>
+            <w:r>
+              <w:tab/>
+            </w:r>
+          </w:p>
+        </w:tc>
+        <w:tc>
+          <w:tcPr>
+            <w:tcW w:w="1450" w:type="dxa"/>
+          </w:tcPr>
+          <w:p>
+            <w:r>
+              <w:t>Tuan Thanh Nguyen</w:t>
+            </w:r>
+          </w:p>
+        </w:tc>
+        <w:tc>
+          <w:tcPr>
+            <w:tcW w:w="1842" w:type="dxa"/>
+          </w:tcPr>
+          <w:p>
+            <w:r>
+              <w:t>Apr 15, 2026</w:t>
+            </w:r>
+          </w:p>
+        </w:tc>
+        <w:tc>
+          <w:tcPr>
+            <w:tcW w:w="4395" w:type="dxa"/>
+          </w:tcPr>
+          <w:p>
+            <w:r>
+              <w:t>Diagnosed and fixed a systematic sleep overshoot: the original loop used slept += 50 to track elapsed time, but Thread.Sleep(50) rounds up to the nearest Windows timer tick (~62 ms at default 15.6 ms resolution), accumulating up to 240 ms of dead time per lamp at typical simulation speeds. Replaced the counter with a real-elapsed-time exit condition (DateTime.Now.Ticks) and passes the remaining milliseconds to Thread.Sleep so the final iteration does not overshoot.</w:t>
             </w:r>
           </w:p>
         </w:tc>
@@ -882,6 +1858,591 @@
     </w:sectPr>
   </w:body>
 </w:document>
+</file>
+
+<file path=word/numbering.xml><?xml version="1.0" encoding="utf-8"?>
+<w:numbering xmlns:wpc="http://schemas.microsoft.com/office/word/2010/wordprocessingCanvas" xmlns:cx="http://schemas.microsoft.com/office/drawing/2014/chartex" xmlns:cx1="http://schemas.microsoft.com/office/drawing/2015/9/8/chartex" xmlns:cx2="http://schemas.microsoft.com/office/drawing/2015/10/21/chartex" xmlns:cx3="http://schemas.microsoft.com/office/drawing/2016/5/9/chartex" xmlns:cx4="http://schemas.microsoft.com/office/drawing/2016/5/10/chartex" xmlns:cx5="http://schemas.microsoft.com/office/drawing/2016/5/11/chartex" xmlns:cx6="http://schemas.microsoft.com/office/drawing/2016/5/12/chartex" xmlns:cx7="http://schemas.microsoft.com/office/drawing/2016/5/13/chartex" xmlns:cx8="http://schemas.microsoft.com/office/drawing/2016/5/14/chartex" xmlns:mc="http://schemas.openxmlformats.org/markup-compatibility/2006" xmlns:aink="http://schemas.microsoft.com/office/drawing/2016/ink" xmlns:am3d="http://schemas.microsoft.com/office/drawing/2017/model3d" xmlns:o="urn:schemas-microsoft-com:office:office" xmlns:oel="http://schemas.microsoft.com/office/2019/extlst" xmlns:r="http://schemas.openxmlformats.org/officeDocument/2006/relationships" xmlns:m="http://schemas.openxmlformats.org/officeDocument/2006/math" xmlns:v="urn:schemas-microsoft-com:vml" xmlns:wp14="http://schemas.microsoft.com/office/word/2010/wordprocessingDrawing" xmlns:wp="http://schemas.openxmlformats.org/drawingml/2006/wordprocessingDrawing" xmlns:w10="urn:schemas-microsoft-com:office:word" xmlns:w="http://schemas.openxmlformats.org/wordprocessingml/2006/main" xmlns:w14="http://schemas.microsoft.com/office/word/2010/wordml" xmlns:w15="http://schemas.microsoft.com/office/word/2012/wordml" xmlns:w16cex="http://schemas.microsoft.com/office/word/2018/wordml/cex" xmlns:w16cid="http://schemas.microsoft.com/office/word/2016/wordml/cid" xmlns:w16="http://schemas.microsoft.com/office/word/2018/wordml" xmlns:w16du="http://schemas.microsoft.com/office/word/2023/wordml/word16du" xmlns:w16sdtdh="http://schemas.microsoft.com/office/word/2020/wordml/sdtdatahash" xmlns:w16sdtfl="http://schemas.microsoft.com/office/word/2024/wordml/sdtformatlock" xmlns:w16se="http://schemas.microsoft.com/office/word/2015/wordml/symex" xmlns:wpg="http://schemas.microsoft.com/office/word/2010/wordprocessingGroup" xmlns:wpi="http://schemas.microsoft.com/office/word/2010/wordprocessingInk" xmlns:wne="http://schemas.microsoft.com/office/word/2006/wordml" xmlns:wps="http://schemas.microsoft.com/office/word/2010/wordprocessingShape" mc:Ignorable="w14 w15 w16se w16cid w16 w16cex w16sdtdh w16sdtfl w16du wp14">
+  <w:abstractNum w:abstractNumId="0" w15:restartNumberingAfterBreak="0">
+    <w:nsid w:val="1169171A"/>
+    <w:multiLevelType w:val="hybridMultilevel"/>
+    <w:tmpl w:val="E138E506"/>
+    <w:lvl w:ilvl="0" w:tplc="10090001">
+      <w:start w:val="1"/>
+      <w:numFmt w:val="bullet"/>
+      <w:lvlText w:val=""/>
+      <w:lvlJc w:val="left"/>
+      <w:pPr>
+        <w:ind w:left="720" w:hanging="360"/>
+      </w:pPr>
+      <w:rPr>
+        <w:rFonts w:ascii="Symbol" w:hAnsi="Symbol" w:hint="default"/>
+      </w:rPr>
+    </w:lvl>
+    <w:lvl w:ilvl="1" w:tplc="10090003" w:tentative="1">
+      <w:start w:val="1"/>
+      <w:numFmt w:val="bullet"/>
+      <w:lvlText w:val="o"/>
+      <w:lvlJc w:val="left"/>
+      <w:pPr>
+        <w:ind w:left="1440" w:hanging="360"/>
+      </w:pPr>
+      <w:rPr>
+        <w:rFonts w:ascii="Courier New" w:hAnsi="Courier New" w:cs="Courier New" w:hint="default"/>
+      </w:rPr>
+    </w:lvl>
+    <w:lvl w:ilvl="2" w:tplc="10090005" w:tentative="1">
+      <w:start w:val="1"/>
+      <w:numFmt w:val="bullet"/>
+      <w:lvlText w:val=""/>
+      <w:lvlJc w:val="left"/>
+      <w:pPr>
+        <w:ind w:left="2160" w:hanging="360"/>
+      </w:pPr>
+      <w:rPr>
+        <w:rFonts w:ascii="Wingdings" w:hAnsi="Wingdings" w:hint="default"/>
+      </w:rPr>
+    </w:lvl>
+    <w:lvl w:ilvl="3" w:tplc="10090001" w:tentative="1">
+      <w:start w:val="1"/>
+      <w:numFmt w:val="bullet"/>
+      <w:lvlText w:val=""/>
+      <w:lvlJc w:val="left"/>
+      <w:pPr>
+        <w:ind w:left="2880" w:hanging="360"/>
+      </w:pPr>
+      <w:rPr>
+        <w:rFonts w:ascii="Symbol" w:hAnsi="Symbol" w:hint="default"/>
+      </w:rPr>
+    </w:lvl>
+    <w:lvl w:ilvl="4" w:tplc="10090003" w:tentative="1">
+      <w:start w:val="1"/>
+      <w:numFmt w:val="bullet"/>
+      <w:lvlText w:val="o"/>
+      <w:lvlJc w:val="left"/>
+      <w:pPr>
+        <w:ind w:left="3600" w:hanging="360"/>
+      </w:pPr>
+      <w:rPr>
+        <w:rFonts w:ascii="Courier New" w:hAnsi="Courier New" w:cs="Courier New" w:hint="default"/>
+      </w:rPr>
+    </w:lvl>
+    <w:lvl w:ilvl="5" w:tplc="10090005" w:tentative="1">
+      <w:start w:val="1"/>
+      <w:numFmt w:val="bullet"/>
+      <w:lvlText w:val=""/>
+      <w:lvlJc w:val="left"/>
+      <w:pPr>
+        <w:ind w:left="4320" w:hanging="360"/>
+      </w:pPr>
+      <w:rPr>
+        <w:rFonts w:ascii="Wingdings" w:hAnsi="Wingdings" w:hint="default"/>
+      </w:rPr>
+    </w:lvl>
+    <w:lvl w:ilvl="6" w:tplc="10090001" w:tentative="1">
+      <w:start w:val="1"/>
+      <w:numFmt w:val="bullet"/>
+      <w:lvlText w:val=""/>
+      <w:lvlJc w:val="left"/>
+      <w:pPr>
+        <w:ind w:left="5040" w:hanging="360"/>
+      </w:pPr>
+      <w:rPr>
+        <w:rFonts w:ascii="Symbol" w:hAnsi="Symbol" w:hint="default"/>
+      </w:rPr>
+    </w:lvl>
+    <w:lvl w:ilvl="7" w:tplc="10090003" w:tentative="1">
+      <w:start w:val="1"/>
+      <w:numFmt w:val="bullet"/>
+      <w:lvlText w:val="o"/>
+      <w:lvlJc w:val="left"/>
+      <w:pPr>
+        <w:ind w:left="5760" w:hanging="360"/>
+      </w:pPr>
+      <w:rPr>
+        <w:rFonts w:ascii="Courier New" w:hAnsi="Courier New" w:cs="Courier New" w:hint="default"/>
+      </w:rPr>
+    </w:lvl>
+    <w:lvl w:ilvl="8" w:tplc="10090005" w:tentative="1">
+      <w:start w:val="1"/>
+      <w:numFmt w:val="bullet"/>
+      <w:lvlText w:val=""/>
+      <w:lvlJc w:val="left"/>
+      <w:pPr>
+        <w:ind w:left="6480" w:hanging="360"/>
+      </w:pPr>
+      <w:rPr>
+        <w:rFonts w:ascii="Wingdings" w:hAnsi="Wingdings" w:hint="default"/>
+      </w:rPr>
+    </w:lvl>
+  </w:abstractNum>
+  <w:abstractNum w:abstractNumId="1" w15:restartNumberingAfterBreak="0">
+    <w:nsid w:val="12322FF6"/>
+    <w:multiLevelType w:val="hybridMultilevel"/>
+    <w:tmpl w:val="2286E03E"/>
+    <w:lvl w:ilvl="0" w:tplc="10090001">
+      <w:start w:val="1"/>
+      <w:numFmt w:val="bullet"/>
+      <w:lvlText w:val=""/>
+      <w:lvlJc w:val="left"/>
+      <w:pPr>
+        <w:ind w:left="765" w:hanging="360"/>
+      </w:pPr>
+      <w:rPr>
+        <w:rFonts w:ascii="Symbol" w:hAnsi="Symbol" w:hint="default"/>
+      </w:rPr>
+    </w:lvl>
+    <w:lvl w:ilvl="1" w:tplc="10090003" w:tentative="1">
+      <w:start w:val="1"/>
+      <w:numFmt w:val="bullet"/>
+      <w:lvlText w:val="o"/>
+      <w:lvlJc w:val="left"/>
+      <w:pPr>
+        <w:ind w:left="1485" w:hanging="360"/>
+      </w:pPr>
+      <w:rPr>
+        <w:rFonts w:ascii="Courier New" w:hAnsi="Courier New" w:cs="Courier New" w:hint="default"/>
+      </w:rPr>
+    </w:lvl>
+    <w:lvl w:ilvl="2" w:tplc="10090005" w:tentative="1">
+      <w:start w:val="1"/>
+      <w:numFmt w:val="bullet"/>
+      <w:lvlText w:val=""/>
+      <w:lvlJc w:val="left"/>
+      <w:pPr>
+        <w:ind w:left="2205" w:hanging="360"/>
+      </w:pPr>
+      <w:rPr>
+        <w:rFonts w:ascii="Wingdings" w:hAnsi="Wingdings" w:hint="default"/>
+      </w:rPr>
+    </w:lvl>
+    <w:lvl w:ilvl="3" w:tplc="10090001" w:tentative="1">
+      <w:start w:val="1"/>
+      <w:numFmt w:val="bullet"/>
+      <w:lvlText w:val=""/>
+      <w:lvlJc w:val="left"/>
+      <w:pPr>
+        <w:ind w:left="2925" w:hanging="360"/>
+      </w:pPr>
+      <w:rPr>
+        <w:rFonts w:ascii="Symbol" w:hAnsi="Symbol" w:hint="default"/>
+      </w:rPr>
+    </w:lvl>
+    <w:lvl w:ilvl="4" w:tplc="10090003" w:tentative="1">
+      <w:start w:val="1"/>
+      <w:numFmt w:val="bullet"/>
+      <w:lvlText w:val="o"/>
+      <w:lvlJc w:val="left"/>
+      <w:pPr>
+        <w:ind w:left="3645" w:hanging="360"/>
+      </w:pPr>
+      <w:rPr>
+        <w:rFonts w:ascii="Courier New" w:hAnsi="Courier New" w:cs="Courier New" w:hint="default"/>
+      </w:rPr>
+    </w:lvl>
+    <w:lvl w:ilvl="5" w:tplc="10090005" w:tentative="1">
+      <w:start w:val="1"/>
+      <w:numFmt w:val="bullet"/>
+      <w:lvlText w:val=""/>
+      <w:lvlJc w:val="left"/>
+      <w:pPr>
+        <w:ind w:left="4365" w:hanging="360"/>
+      </w:pPr>
+      <w:rPr>
+        <w:rFonts w:ascii="Wingdings" w:hAnsi="Wingdings" w:hint="default"/>
+      </w:rPr>
+    </w:lvl>
+    <w:lvl w:ilvl="6" w:tplc="10090001" w:tentative="1">
+      <w:start w:val="1"/>
+      <w:numFmt w:val="bullet"/>
+      <w:lvlText w:val=""/>
+      <w:lvlJc w:val="left"/>
+      <w:pPr>
+        <w:ind w:left="5085" w:hanging="360"/>
+      </w:pPr>
+      <w:rPr>
+        <w:rFonts w:ascii="Symbol" w:hAnsi="Symbol" w:hint="default"/>
+      </w:rPr>
+    </w:lvl>
+    <w:lvl w:ilvl="7" w:tplc="10090003" w:tentative="1">
+      <w:start w:val="1"/>
+      <w:numFmt w:val="bullet"/>
+      <w:lvlText w:val="o"/>
+      <w:lvlJc w:val="left"/>
+      <w:pPr>
+        <w:ind w:left="5805" w:hanging="360"/>
+      </w:pPr>
+      <w:rPr>
+        <w:rFonts w:ascii="Courier New" w:hAnsi="Courier New" w:cs="Courier New" w:hint="default"/>
+      </w:rPr>
+    </w:lvl>
+    <w:lvl w:ilvl="8" w:tplc="10090005" w:tentative="1">
+      <w:start w:val="1"/>
+      <w:numFmt w:val="bullet"/>
+      <w:lvlText w:val=""/>
+      <w:lvlJc w:val="left"/>
+      <w:pPr>
+        <w:ind w:left="6525" w:hanging="360"/>
+      </w:pPr>
+      <w:rPr>
+        <w:rFonts w:ascii="Wingdings" w:hAnsi="Wingdings" w:hint="default"/>
+      </w:rPr>
+    </w:lvl>
+  </w:abstractNum>
+  <w:abstractNum w:abstractNumId="2" w15:restartNumberingAfterBreak="0">
+    <w:nsid w:val="40663D68"/>
+    <w:multiLevelType w:val="hybridMultilevel"/>
+    <w:tmpl w:val="FCD89900"/>
+    <w:lvl w:ilvl="0" w:tplc="10090001">
+      <w:start w:val="1"/>
+      <w:numFmt w:val="bullet"/>
+      <w:lvlText w:val=""/>
+      <w:lvlJc w:val="left"/>
+      <w:pPr>
+        <w:ind w:left="720" w:hanging="360"/>
+      </w:pPr>
+      <w:rPr>
+        <w:rFonts w:ascii="Symbol" w:hAnsi="Symbol" w:hint="default"/>
+      </w:rPr>
+    </w:lvl>
+    <w:lvl w:ilvl="1" w:tplc="10090003" w:tentative="1">
+      <w:start w:val="1"/>
+      <w:numFmt w:val="bullet"/>
+      <w:lvlText w:val="o"/>
+      <w:lvlJc w:val="left"/>
+      <w:pPr>
+        <w:ind w:left="1440" w:hanging="360"/>
+      </w:pPr>
+      <w:rPr>
+        <w:rFonts w:ascii="Courier New" w:hAnsi="Courier New" w:cs="Courier New" w:hint="default"/>
+      </w:rPr>
+    </w:lvl>
+    <w:lvl w:ilvl="2" w:tplc="10090005" w:tentative="1">
+      <w:start w:val="1"/>
+      <w:numFmt w:val="bullet"/>
+      <w:lvlText w:val=""/>
+      <w:lvlJc w:val="left"/>
+      <w:pPr>
+        <w:ind w:left="2160" w:hanging="360"/>
+      </w:pPr>
+      <w:rPr>
+        <w:rFonts w:ascii="Wingdings" w:hAnsi="Wingdings" w:hint="default"/>
+      </w:rPr>
+    </w:lvl>
+    <w:lvl w:ilvl="3" w:tplc="10090001" w:tentative="1">
+      <w:start w:val="1"/>
+      <w:numFmt w:val="bullet"/>
+      <w:lvlText w:val=""/>
+      <w:lvlJc w:val="left"/>
+      <w:pPr>
+        <w:ind w:left="2880" w:hanging="360"/>
+      </w:pPr>
+      <w:rPr>
+        <w:rFonts w:ascii="Symbol" w:hAnsi="Symbol" w:hint="default"/>
+      </w:rPr>
+    </w:lvl>
+    <w:lvl w:ilvl="4" w:tplc="10090003" w:tentative="1">
+      <w:start w:val="1"/>
+      <w:numFmt w:val="bullet"/>
+      <w:lvlText w:val="o"/>
+      <w:lvlJc w:val="left"/>
+      <w:pPr>
+        <w:ind w:left="3600" w:hanging="360"/>
+      </w:pPr>
+      <w:rPr>
+        <w:rFonts w:ascii="Courier New" w:hAnsi="Courier New" w:cs="Courier New" w:hint="default"/>
+      </w:rPr>
+    </w:lvl>
+    <w:lvl w:ilvl="5" w:tplc="10090005" w:tentative="1">
+      <w:start w:val="1"/>
+      <w:numFmt w:val="bullet"/>
+      <w:lvlText w:val=""/>
+      <w:lvlJc w:val="left"/>
+      <w:pPr>
+        <w:ind w:left="4320" w:hanging="360"/>
+      </w:pPr>
+      <w:rPr>
+        <w:rFonts w:ascii="Wingdings" w:hAnsi="Wingdings" w:hint="default"/>
+      </w:rPr>
+    </w:lvl>
+    <w:lvl w:ilvl="6" w:tplc="10090001" w:tentative="1">
+      <w:start w:val="1"/>
+      <w:numFmt w:val="bullet"/>
+      <w:lvlText w:val=""/>
+      <w:lvlJc w:val="left"/>
+      <w:pPr>
+        <w:ind w:left="5040" w:hanging="360"/>
+      </w:pPr>
+      <w:rPr>
+        <w:rFonts w:ascii="Symbol" w:hAnsi="Symbol" w:hint="default"/>
+      </w:rPr>
+    </w:lvl>
+    <w:lvl w:ilvl="7" w:tplc="10090003" w:tentative="1">
+      <w:start w:val="1"/>
+      <w:numFmt w:val="bullet"/>
+      <w:lvlText w:val="o"/>
+      <w:lvlJc w:val="left"/>
+      <w:pPr>
+        <w:ind w:left="5760" w:hanging="360"/>
+      </w:pPr>
+      <w:rPr>
+        <w:rFonts w:ascii="Courier New" w:hAnsi="Courier New" w:cs="Courier New" w:hint="default"/>
+      </w:rPr>
+    </w:lvl>
+    <w:lvl w:ilvl="8" w:tplc="10090005" w:tentative="1">
+      <w:start w:val="1"/>
+      <w:numFmt w:val="bullet"/>
+      <w:lvlText w:val=""/>
+      <w:lvlJc w:val="left"/>
+      <w:pPr>
+        <w:ind w:left="6480" w:hanging="360"/>
+      </w:pPr>
+      <w:rPr>
+        <w:rFonts w:ascii="Wingdings" w:hAnsi="Wingdings" w:hint="default"/>
+      </w:rPr>
+    </w:lvl>
+  </w:abstractNum>
+  <w:abstractNum w:abstractNumId="3" w15:restartNumberingAfterBreak="0">
+    <w:nsid w:val="5AA950A2"/>
+    <w:multiLevelType w:val="hybridMultilevel"/>
+    <w:tmpl w:val="25208712"/>
+    <w:lvl w:ilvl="0" w:tplc="10090001">
+      <w:start w:val="1"/>
+      <w:numFmt w:val="bullet"/>
+      <w:lvlText w:val=""/>
+      <w:lvlJc w:val="left"/>
+      <w:pPr>
+        <w:ind w:left="776" w:hanging="360"/>
+      </w:pPr>
+      <w:rPr>
+        <w:rFonts w:ascii="Symbol" w:hAnsi="Symbol" w:hint="default"/>
+      </w:rPr>
+    </w:lvl>
+    <w:lvl w:ilvl="1" w:tplc="10090003" w:tentative="1">
+      <w:start w:val="1"/>
+      <w:numFmt w:val="bullet"/>
+      <w:lvlText w:val="o"/>
+      <w:lvlJc w:val="left"/>
+      <w:pPr>
+        <w:ind w:left="1496" w:hanging="360"/>
+      </w:pPr>
+      <w:rPr>
+        <w:rFonts w:ascii="Courier New" w:hAnsi="Courier New" w:cs="Courier New" w:hint="default"/>
+      </w:rPr>
+    </w:lvl>
+    <w:lvl w:ilvl="2" w:tplc="10090005" w:tentative="1">
+      <w:start w:val="1"/>
+      <w:numFmt w:val="bullet"/>
+      <w:lvlText w:val=""/>
+      <w:lvlJc w:val="left"/>
+      <w:pPr>
+        <w:ind w:left="2216" w:hanging="360"/>
+      </w:pPr>
+      <w:rPr>
+        <w:rFonts w:ascii="Wingdings" w:hAnsi="Wingdings" w:hint="default"/>
+      </w:rPr>
+    </w:lvl>
+    <w:lvl w:ilvl="3" w:tplc="10090001" w:tentative="1">
+      <w:start w:val="1"/>
+      <w:numFmt w:val="bullet"/>
+      <w:lvlText w:val=""/>
+      <w:lvlJc w:val="left"/>
+      <w:pPr>
+        <w:ind w:left="2936" w:hanging="360"/>
+      </w:pPr>
+      <w:rPr>
+        <w:rFonts w:ascii="Symbol" w:hAnsi="Symbol" w:hint="default"/>
+      </w:rPr>
+    </w:lvl>
+    <w:lvl w:ilvl="4" w:tplc="10090003" w:tentative="1">
+      <w:start w:val="1"/>
+      <w:numFmt w:val="bullet"/>
+      <w:lvlText w:val="o"/>
+      <w:lvlJc w:val="left"/>
+      <w:pPr>
+        <w:ind w:left="3656" w:hanging="360"/>
+      </w:pPr>
+      <w:rPr>
+        <w:rFonts w:ascii="Courier New" w:hAnsi="Courier New" w:cs="Courier New" w:hint="default"/>
+      </w:rPr>
+    </w:lvl>
+    <w:lvl w:ilvl="5" w:tplc="10090005" w:tentative="1">
+      <w:start w:val="1"/>
+      <w:numFmt w:val="bullet"/>
+      <w:lvlText w:val=""/>
+      <w:lvlJc w:val="left"/>
+      <w:pPr>
+        <w:ind w:left="4376" w:hanging="360"/>
+      </w:pPr>
+      <w:rPr>
+        <w:rFonts w:ascii="Wingdings" w:hAnsi="Wingdings" w:hint="default"/>
+      </w:rPr>
+    </w:lvl>
+    <w:lvl w:ilvl="6" w:tplc="10090001" w:tentative="1">
+      <w:start w:val="1"/>
+      <w:numFmt w:val="bullet"/>
+      <w:lvlText w:val=""/>
+      <w:lvlJc w:val="left"/>
+      <w:pPr>
+        <w:ind w:left="5096" w:hanging="360"/>
+      </w:pPr>
+      <w:rPr>
+        <w:rFonts w:ascii="Symbol" w:hAnsi="Symbol" w:hint="default"/>
+      </w:rPr>
+    </w:lvl>
+    <w:lvl w:ilvl="7" w:tplc="10090003" w:tentative="1">
+      <w:start w:val="1"/>
+      <w:numFmt w:val="bullet"/>
+      <w:lvlText w:val="o"/>
+      <w:lvlJc w:val="left"/>
+      <w:pPr>
+        <w:ind w:left="5816" w:hanging="360"/>
+      </w:pPr>
+      <w:rPr>
+        <w:rFonts w:ascii="Courier New" w:hAnsi="Courier New" w:cs="Courier New" w:hint="default"/>
+      </w:rPr>
+    </w:lvl>
+    <w:lvl w:ilvl="8" w:tplc="10090005" w:tentative="1">
+      <w:start w:val="1"/>
+      <w:numFmt w:val="bullet"/>
+      <w:lvlText w:val=""/>
+      <w:lvlJc w:val="left"/>
+      <w:pPr>
+        <w:ind w:left="6536" w:hanging="360"/>
+      </w:pPr>
+      <w:rPr>
+        <w:rFonts w:ascii="Wingdings" w:hAnsi="Wingdings" w:hint="default"/>
+      </w:rPr>
+    </w:lvl>
+  </w:abstractNum>
+  <w:abstractNum w:abstractNumId="4" w15:restartNumberingAfterBreak="0">
+    <w:nsid w:val="78727F5B"/>
+    <w:multiLevelType w:val="hybridMultilevel"/>
+    <w:tmpl w:val="48682FF4"/>
+    <w:lvl w:ilvl="0" w:tplc="10090001">
+      <w:start w:val="1"/>
+      <w:numFmt w:val="bullet"/>
+      <w:lvlText w:val=""/>
+      <w:lvlJc w:val="left"/>
+      <w:pPr>
+        <w:ind w:left="720" w:hanging="360"/>
+      </w:pPr>
+      <w:rPr>
+        <w:rFonts w:ascii="Symbol" w:hAnsi="Symbol" w:hint="default"/>
+      </w:rPr>
+    </w:lvl>
+    <w:lvl w:ilvl="1" w:tplc="10090003" w:tentative="1">
+      <w:start w:val="1"/>
+      <w:numFmt w:val="bullet"/>
+      <w:lvlText w:val="o"/>
+      <w:lvlJc w:val="left"/>
+      <w:pPr>
+        <w:ind w:left="1440" w:hanging="360"/>
+      </w:pPr>
+      <w:rPr>
+        <w:rFonts w:ascii="Courier New" w:hAnsi="Courier New" w:cs="Courier New" w:hint="default"/>
+      </w:rPr>
+    </w:lvl>
+    <w:lvl w:ilvl="2" w:tplc="10090005" w:tentative="1">
+      <w:start w:val="1"/>
+      <w:numFmt w:val="bullet"/>
+      <w:lvlText w:val=""/>
+      <w:lvlJc w:val="left"/>
+      <w:pPr>
+        <w:ind w:left="2160" w:hanging="360"/>
+      </w:pPr>
+      <w:rPr>
+        <w:rFonts w:ascii="Wingdings" w:hAnsi="Wingdings" w:hint="default"/>
+      </w:rPr>
+    </w:lvl>
+    <w:lvl w:ilvl="3" w:tplc="10090001" w:tentative="1">
+      <w:start w:val="1"/>
+      <w:numFmt w:val="bullet"/>
+      <w:lvlText w:val=""/>
+      <w:lvlJc w:val="left"/>
+      <w:pPr>
+        <w:ind w:left="2880" w:hanging="360"/>
+      </w:pPr>
+      <w:rPr>
+        <w:rFonts w:ascii="Symbol" w:hAnsi="Symbol" w:hint="default"/>
+      </w:rPr>
+    </w:lvl>
+    <w:lvl w:ilvl="4" w:tplc="10090003" w:tentative="1">
+      <w:start w:val="1"/>
+      <w:numFmt w:val="bullet"/>
+      <w:lvlText w:val="o"/>
+      <w:lvlJc w:val="left"/>
+      <w:pPr>
+        <w:ind w:left="3600" w:hanging="360"/>
+      </w:pPr>
+      <w:rPr>
+        <w:rFonts w:ascii="Courier New" w:hAnsi="Courier New" w:cs="Courier New" w:hint="default"/>
+      </w:rPr>
+    </w:lvl>
+    <w:lvl w:ilvl="5" w:tplc="10090005" w:tentative="1">
+      <w:start w:val="1"/>
+      <w:numFmt w:val="bullet"/>
+      <w:lvlText w:val=""/>
+      <w:lvlJc w:val="left"/>
+      <w:pPr>
+        <w:ind w:left="4320" w:hanging="360"/>
+      </w:pPr>
+      <w:rPr>
+        <w:rFonts w:ascii="Wingdings" w:hAnsi="Wingdings" w:hint="default"/>
+      </w:rPr>
+    </w:lvl>
+    <w:lvl w:ilvl="6" w:tplc="10090001" w:tentative="1">
+      <w:start w:val="1"/>
+      <w:numFmt w:val="bullet"/>
+      <w:lvlText w:val=""/>
+      <w:lvlJc w:val="left"/>
+      <w:pPr>
+        <w:ind w:left="5040" w:hanging="360"/>
+      </w:pPr>
+      <w:rPr>
+        <w:rFonts w:ascii="Symbol" w:hAnsi="Symbol" w:hint="default"/>
+      </w:rPr>
+    </w:lvl>
+    <w:lvl w:ilvl="7" w:tplc="10090003" w:tentative="1">
+      <w:start w:val="1"/>
+      <w:numFmt w:val="bullet"/>
+      <w:lvlText w:val="o"/>
+      <w:lvlJc w:val="left"/>
+      <w:pPr>
+        <w:ind w:left="5760" w:hanging="360"/>
+      </w:pPr>
+      <w:rPr>
+        <w:rFonts w:ascii="Courier New" w:hAnsi="Courier New" w:cs="Courier New" w:hint="default"/>
+      </w:rPr>
+    </w:lvl>
+    <w:lvl w:ilvl="8" w:tplc="10090005" w:tentative="1">
+      <w:start w:val="1"/>
+      <w:numFmt w:val="bullet"/>
+      <w:lvlText w:val=""/>
+      <w:lvlJc w:val="left"/>
+      <w:pPr>
+        <w:ind w:left="6480" w:hanging="360"/>
+      </w:pPr>
+      <w:rPr>
+        <w:rFonts w:ascii="Wingdings" w:hAnsi="Wingdings" w:hint="default"/>
+      </w:rPr>
+    </w:lvl>
+  </w:abstractNum>
+  <w:num w:numId="1" w16cid:durableId="824127911">
+    <w:abstractNumId w:val="1"/>
+  </w:num>
+  <w:num w:numId="2" w16cid:durableId="1391153543">
+    <w:abstractNumId w:val="4"/>
+  </w:num>
+  <w:num w:numId="3" w16cid:durableId="194658611">
+    <w:abstractNumId w:val="0"/>
+  </w:num>
+  <w:num w:numId="4" w16cid:durableId="838815423">
+    <w:abstractNumId w:val="2"/>
+  </w:num>
+  <w:num w:numId="5" w16cid:durableId="721976784">
+    <w:abstractNumId w:val="3"/>
+  </w:num>
+</w:numbering>
 </file>
 
 <file path=word/styles.xml><?xml version="1.0" encoding="utf-8"?>
@@ -1486,6 +3047,7 @@
   <w:style w:type="character" w:default="1" w:styleId="DefaultParagraphFont">
     <w:name w:val="Default Paragraph Font"/>
     <w:uiPriority w:val="1"/>
+    <w:semiHidden/>
     <w:unhideWhenUsed/>
   </w:style>
   <w:style w:type="table" w:default="1" w:styleId="TableNormal">

</xml_diff>